<commit_message>
Rewrite the Hub pitch as a sitting story and refresh Lean Canvas for an early investor.
Keep evidence, a named gap, and interview-ready in the talk so the Ireland sitting still sounds like the original product. Canvas rev 6 uses sourced numbers and a readable problem and solution.

Co-authored-by: Cursor <cursoragent@cursor.com>
</commit_message>
<xml_diff>
--- a/docs/SkillsAtlas_Hub_Pitch_Slide_Text_TEAM_DRAFT.docx
+++ b/docs/SkillsAtlas_Hub_Pitch_Slide_Text_TEAM_DRAFT.docx
@@ -44,7 +44,7 @@
           <w:color w:val="2C2C2C"/>
           <w:sz w:val="24"/>
         </w:rPr>
-        <w:t>Words for the slides and the 7-minute talk. Not sealed. Comment here, then we lock the lines and start designing.</w:t>
+        <w:t>Words for the slides and the 7-minute talk. A story that works with or without slides. Not sealed. Comment here, then we lock the lines and start designing.</w:t>
       </w:r>
     </w:p>
     <w:tbl>
@@ -293,7 +293,7 @@
                 <w:color w:val="2C2C2C"/>
                 <w:sz w:val="21"/>
               </w:rPr>
-              <w:t>Designer: type only the “On the slide” lines. Talker: use Spoken + the script at the end. Clicker: Slide 5 only.</w:t>
+              <w:t>Designer: type only the “On the slide” lines. Use Picture as the layout brief. Talker: Spoken + the script at the end. Clicker: Slide 5 only.</w:t>
             </w:r>
           </w:p>
           <w:p>
@@ -445,7 +445,7 @@
                 <w:color w:val="2C2C2C"/>
                 <w:sz w:val="20"/>
               </w:rPr>
-              <w:t>Speaks. Never holds the mouse.</w:t>
+              <w:t>Speaks. Never holds the mouse. The script at the end works with or without slides.</w:t>
             </w:r>
           </w:p>
         </w:tc>
@@ -523,7 +523,1104 @@
                 <w:color w:val="2C2C2C"/>
                 <w:sz w:val="20"/>
               </w:rPr>
-              <w:t>Types only the On the slide lines. Ignore spoken notes until layout.</w:t>
+              <w:t>Types only the On the slide lines. Use Picture as the layout brief. Ignore spoken notes until layout.</w:t>
+            </w:r>
+          </w:p>
+        </w:tc>
+      </w:tr>
+    </w:tbl>
+    <w:p>
+      <w:pPr>
+        <w:spacing w:after="160"/>
+      </w:pPr>
+    </w:p>
+    <w:p>
+      <w:pPr>
+        <w:pStyle w:val="Heading1"/>
+      </w:pPr>
+      <w:r>
+        <w:rPr>
+          <w:rFonts w:ascii="Calibri" w:hAnsi="Calibri" w:eastAsia="Calibri"/>
+          <w:color w:val="1B2A4A"/>
+        </w:rPr>
+        <w:t>Founder persona and the aha</w:t>
+      </w:r>
+    </w:p>
+    <w:p>
+      <w:pPr>
+        <w:spacing w:after="160" w:before="0" w:line="240" w:lineRule="auto"/>
+      </w:pPr>
+      <w:r>
+        <w:rPr>
+          <w:rFonts w:ascii="Calibri" w:hAnsi="Calibri" w:eastAsia="Calibri"/>
+          <w:b w:val="0"/>
+          <w:i w:val="0"/>
+          <w:color w:val="2C2C2C"/>
+          <w:sz w:val="22"/>
+        </w:rPr>
+        <w:t>This is who we are in the room. It is not a biography slide. It is the human reason the product exists. Judges score the team. If this is wrong, comment — do not invent a replacement story.</w:t>
+      </w:r>
+    </w:p>
+    <w:p>
+      <w:pPr>
+        <w:spacing w:after="160" w:before="0" w:line="240" w:lineRule="auto"/>
+      </w:pPr>
+      <w:r>
+        <w:rPr>
+          <w:rFonts w:ascii="Calibri" w:hAnsi="Calibri" w:eastAsia="Calibri"/>
+          <w:b w:val="0"/>
+          <w:i w:val="0"/>
+          <w:color w:val="2C2C2C"/>
+          <w:sz w:val="22"/>
+        </w:rPr>
+        <w:t>The field person (Andrew). He sits with the offices that already do this job. This month he sat with an adviser in a small employment office (Enniscorthy, 9 Sep). She already assesses people. She cannot choose the next job for them. They leave with a list. Next time she sees them is about three weeks.</w:t>
+      </w:r>
+    </w:p>
+    <w:p>
+      <w:pPr>
+        <w:spacing w:after="160" w:before="0" w:line="240" w:lineRule="auto"/>
+      </w:pPr>
+      <w:r>
+        <w:rPr>
+          <w:rFonts w:ascii="Calibri" w:hAnsi="Calibri" w:eastAsia="Calibri"/>
+          <w:b w:val="0"/>
+          <w:i w:val="0"/>
+          <w:color w:val="2C2C2C"/>
+          <w:sz w:val="22"/>
+        </w:rPr>
+        <w:t>The aha. Ireland already did the hard half. Someone was assessed. Then they were handed a list and left alone. The plan lived only in their head. The product is not a better assessment, and it is not a better list. It is the next sitting: they confirm the evidence, we name the gap, they pick between two jobs they can reach, and they walk out interview-ready — holding a board they wrote. The adviser does not decide for them. We do not rank them.</w:t>
+      </w:r>
+    </w:p>
+    <w:p>
+      <w:pPr>
+        <w:spacing w:after="160" w:before="0" w:line="240" w:lineRule="auto"/>
+      </w:pPr>
+      <w:r>
+        <w:rPr>
+          <w:rFonts w:ascii="Calibri" w:hAnsi="Calibri" w:eastAsia="Calibri"/>
+          <w:b w:val="0"/>
+          <w:i w:val="0"/>
+          <w:color w:val="2C2C2C"/>
+          <w:sz w:val="22"/>
+        </w:rPr>
+        <w:t>HR in the room (Brigitte). You cannot invent a story for an interview. Confirm first. Then print. That is why skip is free, and why the board only carries what they said was true.</w:t>
+      </w:r>
+    </w:p>
+    <w:p>
+      <w:pPr>
+        <w:spacing w:after="160" w:before="0" w:line="240" w:lineRule="auto"/>
+      </w:pPr>
+      <w:r>
+        <w:rPr>
+          <w:rFonts w:ascii="Calibri" w:hAnsi="Calibri" w:eastAsia="Calibri"/>
+          <w:b w:val="0"/>
+          <w:i w:val="0"/>
+          <w:color w:val="2C2C2C"/>
+          <w:sz w:val="22"/>
+        </w:rPr>
+        <w:t>The rest of the challenge team. We can show this sitting cold, in two weeks, with a recording in the next tab if the wifi dies. Names, who talks, who clicks: still a yellow box on Slide 9.</w:t>
+      </w:r>
+    </w:p>
+    <w:p>
+      <w:pPr>
+        <w:spacing w:after="160" w:before="0" w:line="240" w:lineRule="auto"/>
+      </w:pPr>
+      <w:r>
+        <w:rPr>
+          <w:rFonts w:ascii="Calibri" w:hAnsi="Calibri" w:eastAsia="Calibri"/>
+          <w:b w:val="0"/>
+          <w:i w:val="0"/>
+          <w:color w:val="2C2C2C"/>
+          <w:sz w:val="22"/>
+        </w:rPr>
+        <w:t>What we will not say: that the Enniscorthy office is a customer, a pilot, or a logo. A conversation is traction. A conversation is not a contract.</w:t>
+      </w:r>
+    </w:p>
+    <w:tbl>
+      <w:tblPr>
+        <w:tblW w:type="auto" w:w="0"/>
+        <w:tblLayout w:type="autofit"/>
+        <w:tblLook w:firstColumn="1" w:firstRow="1" w:lastColumn="0" w:lastRow="0" w:noHBand="0" w:noVBand="1" w:val="04A0"/>
+      </w:tblPr>
+      <w:tblGrid>
+        <w:gridCol w:w="10200"/>
+      </w:tblGrid>
+      <w:tr>
+        <w:tc>
+          <w:tcPr>
+            <w:tcW w:type="dxa" w:w="10200"/>
+            <w:shd w:fill="FFF4D6" w:val="clear"/>
+          </w:tcPr>
+          <w:p>
+            <w:pPr>
+              <w:spacing w:after="80"/>
+            </w:pPr>
+            <w:r/>
+            <w:r>
+              <w:rPr>
+                <w:rFonts w:ascii="Calibri" w:hAnsi="Calibri" w:eastAsia="Calibri"/>
+                <w:b/>
+                <w:i w:val="0"/>
+                <w:color w:val="C4563A"/>
+                <w:sz w:val="20"/>
+              </w:rPr>
+              <w:t>NOT SEALED — founder line</w:t>
+            </w:r>
+          </w:p>
+          <w:p>
+            <w:pPr>
+              <w:spacing w:after="60" w:before="0"/>
+            </w:pPr>
+            <w:r>
+              <w:rPr>
+                <w:rFonts w:ascii="Calibri" w:hAnsi="Calibri" w:eastAsia="Calibri"/>
+                <w:b w:val="0"/>
+                <w:i w:val="0"/>
+                <w:color w:val="2C2C2C"/>
+                <w:sz w:val="21"/>
+              </w:rPr>
+              <w:t>Working line for Slide 9: One of us sat with an adviser this month. She cannot choose for them. That is why they leave holding a board they wrote.</w:t>
+            </w:r>
+          </w:p>
+          <w:p>
+            <w:pPr>
+              <w:spacing w:after="60" w:before="0"/>
+            </w:pPr>
+            <w:r>
+              <w:rPr>
+                <w:rFonts w:ascii="Calibri" w:hAnsi="Calibri" w:eastAsia="Calibri"/>
+                <w:b w:val="0"/>
+                <w:i w:val="0"/>
+                <w:color w:val="2C2C2C"/>
+                <w:sz w:val="21"/>
+              </w:rPr>
+              <w:t>If that is not true in the room on the day, cut it. Do not replace it with a prettier story.</w:t>
+            </w:r>
+          </w:p>
+        </w:tc>
+      </w:tr>
+    </w:tbl>
+    <w:p>
+      <w:pPr>
+        <w:spacing w:after="200"/>
+      </w:pPr>
+    </w:p>
+    <w:p>
+      <w:pPr>
+        <w:pStyle w:val="Heading1"/>
+      </w:pPr>
+      <w:r>
+        <w:rPr>
+          <w:rFonts w:ascii="Calibri" w:hAnsi="Calibri" w:eastAsia="Calibri"/>
+          <w:color w:val="1B2A4A"/>
+        </w:rPr>
+        <w:t>The story (one breath, no slides)</w:t>
+      </w:r>
+    </w:p>
+    <w:p>
+      <w:pPr>
+        <w:spacing w:after="160" w:before="0" w:line="240" w:lineRule="auto"/>
+      </w:pPr>
+      <w:r>
+        <w:rPr>
+          <w:rFonts w:ascii="Calibri" w:hAnsi="Calibri" w:eastAsia="Calibri"/>
+          <w:b w:val="0"/>
+          <w:i/>
+          <w:color w:val="2C2C2C"/>
+          <w:sz w:val="22"/>
+        </w:rPr>
+        <w:t>Everyone else hands you a list. We hand you proof. Ireland already assesses people, then leaves them alone for three weeks. The sitting already exists. The adviser cannot choose for them. So we take the same CV, they confirm the evidence, we name the gap, they pick between two jobs, and they walk out interview-ready — holding a board. The person never pays. The small office is the buyer. We do not replace their meetings. If the first ten do not come back holding that board, we stop. Send us to Galway. Then one sitting with a real adviser.</w:t>
+      </w:r>
+    </w:p>
+    <w:p>
+      <w:pPr>
+        <w:spacing w:after="240" w:before="0" w:line="240" w:lineRule="auto"/>
+      </w:pPr>
+      <w:r>
+        <w:rPr>
+          <w:rFonts w:ascii="Calibri" w:hAnsi="Calibri" w:eastAsia="Calibri"/>
+          <w:b w:val="0"/>
+          <w:i w:val="0"/>
+          <w:color w:val="2C2C2C"/>
+          <w:sz w:val="22"/>
+        </w:rPr>
+        <w:t>If the projector dies, that is the talk. The slides are pictures of those sentences. They are not a second speech.</w:t>
+      </w:r>
+    </w:p>
+    <w:p>
+      <w:pPr>
+        <w:pStyle w:val="Heading1"/>
+      </w:pPr>
+      <w:r>
+        <w:rPr>
+          <w:rFonts w:ascii="Calibri" w:hAnsi="Calibri" w:eastAsia="Calibri"/>
+          <w:color w:val="1B2A4A"/>
+        </w:rPr>
+        <w:t>How the feeling moves</w:t>
+      </w:r>
+    </w:p>
+    <w:p>
+      <w:pPr>
+        <w:spacing w:after="160" w:before="0" w:line="240" w:lineRule="auto"/>
+      </w:pPr>
+      <w:r>
+        <w:rPr>
+          <w:rFonts w:ascii="Calibri" w:hAnsi="Calibri" w:eastAsia="Calibri"/>
+          <w:b w:val="0"/>
+          <w:i w:val="0"/>
+          <w:color w:val="2C2C2C"/>
+          <w:sz w:val="22"/>
+        </w:rPr>
+        <w:t>One bold idea per slide. One picture. Then the next feeling. Do not restart the argument on every slide. Inevitable does not mean a huge market number. It means: the sitting is already there, the silent weeks are already three weeks, ChatGPT already failed (it is another list), and the only missing artefact is proof they walk out holding — evidence, a named gap, interview-ready.</w:t>
+      </w:r>
+    </w:p>
+    <w:tbl>
+      <w:tblPr>
+        <w:tblStyle w:val="TableGrid"/>
+        <w:tblW w:type="auto" w:w="0"/>
+        <w:tblLayout w:type="autofit"/>
+        <w:tblLook w:firstColumn="1" w:firstRow="1" w:lastColumn="0" w:lastRow="0" w:noHBand="0" w:noVBand="1" w:val="04A0"/>
+      </w:tblPr>
+      <w:tblGrid>
+        <w:gridCol w:w="2550"/>
+        <w:gridCol w:w="2550"/>
+        <w:gridCol w:w="2550"/>
+        <w:gridCol w:w="2550"/>
+      </w:tblGrid>
+      <w:tr>
+        <w:tc>
+          <w:tcPr>
+            <w:tcW w:type="dxa" w:w="2550"/>
+            <w:shd w:fill="1B2A4A" w:val="clear"/>
+          </w:tcPr>
+          <w:p>
+            <w:r/>
+            <w:r>
+              <w:rPr>
+                <w:rFonts w:ascii="Calibri" w:hAnsi="Calibri" w:eastAsia="Calibri"/>
+                <w:b/>
+                <w:i w:val="0"/>
+                <w:color w:val="FFFFFF"/>
+                <w:sz w:val="20"/>
+              </w:rPr>
+              <w:t>Slide</w:t>
+            </w:r>
+          </w:p>
+        </w:tc>
+        <w:tc>
+          <w:tcPr>
+            <w:tcW w:type="dxa" w:w="2550"/>
+            <w:shd w:fill="1B2A4A" w:val="clear"/>
+          </w:tcPr>
+          <w:p>
+            <w:r/>
+            <w:r>
+              <w:rPr>
+                <w:rFonts w:ascii="Calibri" w:hAnsi="Calibri" w:eastAsia="Calibri"/>
+                <w:b/>
+                <w:i w:val="0"/>
+                <w:color w:val="FFFFFF"/>
+                <w:sz w:val="20"/>
+              </w:rPr>
+              <w:t>Bold idea</w:t>
+            </w:r>
+          </w:p>
+        </w:tc>
+        <w:tc>
+          <w:tcPr>
+            <w:tcW w:type="dxa" w:w="2550"/>
+            <w:shd w:fill="1B2A4A" w:val="clear"/>
+          </w:tcPr>
+          <w:p>
+            <w:r/>
+            <w:r>
+              <w:rPr>
+                <w:rFonts w:ascii="Calibri" w:hAnsi="Calibri" w:eastAsia="Calibri"/>
+                <w:b/>
+                <w:i w:val="0"/>
+                <w:color w:val="FFFFFF"/>
+                <w:sz w:val="20"/>
+              </w:rPr>
+              <w:t>Feeling</w:t>
+            </w:r>
+          </w:p>
+        </w:tc>
+        <w:tc>
+          <w:tcPr>
+            <w:tcW w:type="dxa" w:w="2550"/>
+            <w:shd w:fill="1B2A4A" w:val="clear"/>
+          </w:tcPr>
+          <w:p>
+            <w:r/>
+            <w:r>
+              <w:rPr>
+                <w:rFonts w:ascii="Calibri" w:hAnsi="Calibri" w:eastAsia="Calibri"/>
+                <w:b/>
+                <w:i w:val="0"/>
+                <w:color w:val="FFFFFF"/>
+                <w:sz w:val="20"/>
+              </w:rPr>
+              <w:t>Bridge into the next slide</w:t>
+            </w:r>
+          </w:p>
+        </w:tc>
+      </w:tr>
+      <w:tr>
+        <w:tc>
+          <w:tcPr>
+            <w:tcW w:type="dxa" w:w="2550"/>
+          </w:tcPr>
+          <w:p>
+            <w:r/>
+            <w:r>
+              <w:rPr>
+                <w:rFonts w:ascii="Calibri" w:hAnsi="Calibri" w:eastAsia="Calibri"/>
+                <w:b w:val="0"/>
+                <w:i w:val="0"/>
+                <w:color w:val="2C2C2C"/>
+                <w:sz w:val="20"/>
+              </w:rPr>
+              <w:t>1</w:t>
+            </w:r>
+          </w:p>
+        </w:tc>
+        <w:tc>
+          <w:tcPr>
+            <w:tcW w:type="dxa" w:w="2550"/>
+          </w:tcPr>
+          <w:p>
+            <w:r/>
+            <w:r>
+              <w:rPr>
+                <w:rFonts w:ascii="Calibri" w:hAnsi="Calibri" w:eastAsia="Calibri"/>
+                <w:b w:val="0"/>
+                <w:i w:val="0"/>
+                <w:color w:val="2C2C2C"/>
+                <w:sz w:val="20"/>
+              </w:rPr>
+              <w:t>List vs proof</w:t>
+            </w:r>
+          </w:p>
+        </w:tc>
+        <w:tc>
+          <w:tcPr>
+            <w:tcW w:type="dxa" w:w="2550"/>
+          </w:tcPr>
+          <w:p>
+            <w:r/>
+            <w:r>
+              <w:rPr>
+                <w:rFonts w:ascii="Calibri" w:hAnsi="Calibri" w:eastAsia="Calibri"/>
+                <w:b w:val="0"/>
+                <w:i w:val="0"/>
+                <w:color w:val="2C2C2C"/>
+                <w:sz w:val="20"/>
+              </w:rPr>
+              <w:t>Sting</w:t>
+            </w:r>
+          </w:p>
+        </w:tc>
+        <w:tc>
+          <w:tcPr>
+            <w:tcW w:type="dxa" w:w="2550"/>
+          </w:tcPr>
+          <w:p>
+            <w:r/>
+            <w:r>
+              <w:rPr>
+                <w:rFonts w:ascii="Calibri" w:hAnsi="Calibri" w:eastAsia="Calibri"/>
+                <w:b w:val="0"/>
+                <w:i w:val="0"/>
+                <w:color w:val="2C2C2C"/>
+                <w:sz w:val="20"/>
+              </w:rPr>
+              <w:t>That list is not a plan.</w:t>
+            </w:r>
+          </w:p>
+        </w:tc>
+      </w:tr>
+      <w:tr>
+        <w:tc>
+          <w:tcPr>
+            <w:tcW w:type="dxa" w:w="2550"/>
+            <w:shd w:fill="F4F1EA" w:val="clear"/>
+          </w:tcPr>
+          <w:p>
+            <w:r/>
+            <w:r>
+              <w:rPr>
+                <w:rFonts w:ascii="Calibri" w:hAnsi="Calibri" w:eastAsia="Calibri"/>
+                <w:b w:val="0"/>
+                <w:i w:val="0"/>
+                <w:color w:val="2C2C2C"/>
+                <w:sz w:val="20"/>
+              </w:rPr>
+              <w:t>2</w:t>
+            </w:r>
+          </w:p>
+        </w:tc>
+        <w:tc>
+          <w:tcPr>
+            <w:tcW w:type="dxa" w:w="2550"/>
+            <w:shd w:fill="F4F1EA" w:val="clear"/>
+          </w:tcPr>
+          <w:p>
+            <w:r/>
+            <w:r>
+              <w:rPr>
+                <w:rFonts w:ascii="Calibri" w:hAnsi="Calibri" w:eastAsia="Calibri"/>
+                <w:b w:val="0"/>
+                <w:i w:val="0"/>
+                <w:color w:val="2C2C2C"/>
+                <w:sz w:val="20"/>
+              </w:rPr>
+              <w:t>Assessed, then left alone</w:t>
+            </w:r>
+          </w:p>
+        </w:tc>
+        <w:tc>
+          <w:tcPr>
+            <w:tcW w:type="dxa" w:w="2550"/>
+            <w:shd w:fill="F4F1EA" w:val="clear"/>
+          </w:tcPr>
+          <w:p>
+            <w:r/>
+            <w:r>
+              <w:rPr>
+                <w:rFonts w:ascii="Calibri" w:hAnsi="Calibri" w:eastAsia="Calibri"/>
+                <w:b w:val="0"/>
+                <w:i w:val="0"/>
+                <w:color w:val="2C2C2C"/>
+                <w:sz w:val="20"/>
+              </w:rPr>
+              <w:t>The human cost</w:t>
+            </w:r>
+          </w:p>
+        </w:tc>
+        <w:tc>
+          <w:tcPr>
+            <w:tcW w:type="dxa" w:w="2550"/>
+            <w:shd w:fill="F4F1EA" w:val="clear"/>
+          </w:tcPr>
+          <w:p>
+            <w:r/>
+            <w:r>
+              <w:rPr>
+                <w:rFonts w:ascii="Calibri" w:hAnsi="Calibri" w:eastAsia="Calibri"/>
+                <w:b w:val="0"/>
+                <w:i w:val="0"/>
+                <w:color w:val="2C2C2C"/>
+                <w:sz w:val="20"/>
+              </w:rPr>
+              <w:t>We do not replace that meeting.</w:t>
+            </w:r>
+          </w:p>
+        </w:tc>
+      </w:tr>
+      <w:tr>
+        <w:tc>
+          <w:tcPr>
+            <w:tcW w:type="dxa" w:w="2550"/>
+          </w:tcPr>
+          <w:p>
+            <w:r/>
+            <w:r>
+              <w:rPr>
+                <w:rFonts w:ascii="Calibri" w:hAnsi="Calibri" w:eastAsia="Calibri"/>
+                <w:b w:val="0"/>
+                <w:i w:val="0"/>
+                <w:color w:val="2C2C2C"/>
+                <w:sz w:val="20"/>
+              </w:rPr>
+              <w:t>3</w:t>
+            </w:r>
+          </w:p>
+        </w:tc>
+        <w:tc>
+          <w:tcPr>
+            <w:tcW w:type="dxa" w:w="2550"/>
+          </w:tcPr>
+          <w:p>
+            <w:r/>
+            <w:r>
+              <w:rPr>
+                <w:rFonts w:ascii="Calibri" w:hAnsi="Calibri" w:eastAsia="Calibri"/>
+                <w:b w:val="0"/>
+                <w:i w:val="0"/>
+                <w:color w:val="2C2C2C"/>
+                <w:sz w:val="20"/>
+              </w:rPr>
+              <w:t>Four words. The sitting.</w:t>
+            </w:r>
+          </w:p>
+        </w:tc>
+        <w:tc>
+          <w:tcPr>
+            <w:tcW w:type="dxa" w:w="2550"/>
+          </w:tcPr>
+          <w:p>
+            <w:r/>
+            <w:r>
+              <w:rPr>
+                <w:rFonts w:ascii="Calibri" w:hAnsi="Calibri" w:eastAsia="Calibri"/>
+                <w:b w:val="0"/>
+                <w:i w:val="0"/>
+                <w:color w:val="2C2C2C"/>
+                <w:sz w:val="20"/>
+              </w:rPr>
+              <w:t>Relief</w:t>
+            </w:r>
+          </w:p>
+        </w:tc>
+        <w:tc>
+          <w:tcPr>
+            <w:tcW w:type="dxa" w:w="2550"/>
+          </w:tcPr>
+          <w:p>
+            <w:r/>
+            <w:r>
+              <w:rPr>
+                <w:rFonts w:ascii="Calibri" w:hAnsi="Calibri" w:eastAsia="Calibri"/>
+                <w:b w:val="0"/>
+                <w:i w:val="0"/>
+                <w:color w:val="2C2C2C"/>
+                <w:sz w:val="20"/>
+              </w:rPr>
+              <w:t>Watch it. Then click it.</w:t>
+            </w:r>
+          </w:p>
+        </w:tc>
+      </w:tr>
+      <w:tr>
+        <w:tc>
+          <w:tcPr>
+            <w:tcW w:type="dxa" w:w="2550"/>
+            <w:shd w:fill="F4F1EA" w:val="clear"/>
+          </w:tcPr>
+          <w:p>
+            <w:r/>
+            <w:r>
+              <w:rPr>
+                <w:rFonts w:ascii="Calibri" w:hAnsi="Calibri" w:eastAsia="Calibri"/>
+                <w:b w:val="0"/>
+                <w:i w:val="0"/>
+                <w:color w:val="2C2C2C"/>
+                <w:sz w:val="20"/>
+              </w:rPr>
+              <w:t>4</w:t>
+            </w:r>
+          </w:p>
+        </w:tc>
+        <w:tc>
+          <w:tcPr>
+            <w:tcW w:type="dxa" w:w="2550"/>
+            <w:shd w:fill="F4F1EA" w:val="clear"/>
+          </w:tcPr>
+          <w:p>
+            <w:r/>
+            <w:r>
+              <w:rPr>
+                <w:rFonts w:ascii="Calibri" w:hAnsi="Calibri" w:eastAsia="Calibri"/>
+                <w:b w:val="0"/>
+                <w:i w:val="0"/>
+                <w:color w:val="2C2C2C"/>
+                <w:sz w:val="20"/>
+              </w:rPr>
+              <w:t>The sitting, on film</w:t>
+            </w:r>
+          </w:p>
+        </w:tc>
+        <w:tc>
+          <w:tcPr>
+            <w:tcW w:type="dxa" w:w="2550"/>
+            <w:shd w:fill="F4F1EA" w:val="clear"/>
+          </w:tcPr>
+          <w:p>
+            <w:r/>
+            <w:r>
+              <w:rPr>
+                <w:rFonts w:ascii="Calibri" w:hAnsi="Calibri" w:eastAsia="Calibri"/>
+                <w:b w:val="0"/>
+                <w:i w:val="0"/>
+                <w:color w:val="2C2C2C"/>
+                <w:sz w:val="20"/>
+              </w:rPr>
+              <w:t>Quiet / wonder</w:t>
+            </w:r>
+          </w:p>
+        </w:tc>
+        <w:tc>
+          <w:tcPr>
+            <w:tcW w:type="dxa" w:w="2550"/>
+            <w:shd w:fill="F4F1EA" w:val="clear"/>
+          </w:tcPr>
+          <w:p>
+            <w:r/>
+            <w:r>
+              <w:rPr>
+                <w:rFonts w:ascii="Calibri" w:hAnsi="Calibri" w:eastAsia="Calibri"/>
+                <w:b w:val="0"/>
+                <w:i w:val="0"/>
+                <w:color w:val="2C2C2C"/>
+                <w:sz w:val="20"/>
+              </w:rPr>
+              <w:t>Same sitting. On the laptop.</w:t>
+            </w:r>
+          </w:p>
+        </w:tc>
+      </w:tr>
+      <w:tr>
+        <w:tc>
+          <w:tcPr>
+            <w:tcW w:type="dxa" w:w="2550"/>
+          </w:tcPr>
+          <w:p>
+            <w:r/>
+            <w:r>
+              <w:rPr>
+                <w:rFonts w:ascii="Calibri" w:hAnsi="Calibri" w:eastAsia="Calibri"/>
+                <w:b w:val="0"/>
+                <w:i w:val="0"/>
+                <w:color w:val="2C2C2C"/>
+                <w:sz w:val="20"/>
+              </w:rPr>
+              <w:t>5</w:t>
+            </w:r>
+          </w:p>
+        </w:tc>
+        <w:tc>
+          <w:tcPr>
+            <w:tcW w:type="dxa" w:w="2550"/>
+          </w:tcPr>
+          <w:p>
+            <w:r/>
+            <w:r>
+              <w:rPr>
+                <w:rFonts w:ascii="Calibri" w:hAnsi="Calibri" w:eastAsia="Calibri"/>
+                <w:b w:val="0"/>
+                <w:i w:val="0"/>
+                <w:color w:val="2C2C2C"/>
+                <w:sz w:val="20"/>
+              </w:rPr>
+              <w:t>They leave holding the board</w:t>
+            </w:r>
+          </w:p>
+        </w:tc>
+        <w:tc>
+          <w:tcPr>
+            <w:tcW w:type="dxa" w:w="2550"/>
+          </w:tcPr>
+          <w:p>
+            <w:r/>
+            <w:r>
+              <w:rPr>
+                <w:rFonts w:ascii="Calibri" w:hAnsi="Calibri" w:eastAsia="Calibri"/>
+                <w:b w:val="0"/>
+                <w:i w:val="0"/>
+                <w:color w:val="2C2C2C"/>
+                <w:sz w:val="20"/>
+              </w:rPr>
+              <w:t>Trust</w:t>
+            </w:r>
+          </w:p>
+        </w:tc>
+        <w:tc>
+          <w:tcPr>
+            <w:tcW w:type="dxa" w:w="2550"/>
+          </w:tcPr>
+          <w:p>
+            <w:r/>
+            <w:r>
+              <w:rPr>
+                <w:rFonts w:ascii="Calibri" w:hAnsi="Calibri" w:eastAsia="Calibri"/>
+                <w:b w:val="0"/>
+                <w:i w:val="0"/>
+                <w:color w:val="2C2C2C"/>
+                <w:sz w:val="20"/>
+              </w:rPr>
+              <w:t>That person never pays.</w:t>
+            </w:r>
+          </w:p>
+        </w:tc>
+      </w:tr>
+      <w:tr>
+        <w:tc>
+          <w:tcPr>
+            <w:tcW w:type="dxa" w:w="2550"/>
+            <w:shd w:fill="F4F1EA" w:val="clear"/>
+          </w:tcPr>
+          <w:p>
+            <w:r/>
+            <w:r>
+              <w:rPr>
+                <w:rFonts w:ascii="Calibri" w:hAnsi="Calibri" w:eastAsia="Calibri"/>
+                <w:b w:val="0"/>
+                <w:i w:val="0"/>
+                <w:color w:val="2C2C2C"/>
+                <w:sz w:val="20"/>
+              </w:rPr>
+              <w:t>6</w:t>
+            </w:r>
+          </w:p>
+        </w:tc>
+        <w:tc>
+          <w:tcPr>
+            <w:tcW w:type="dxa" w:w="2550"/>
+            <w:shd w:fill="F4F1EA" w:val="clear"/>
+          </w:tcPr>
+          <w:p>
+            <w:r/>
+            <w:r>
+              <w:rPr>
+                <w:rFonts w:ascii="Calibri" w:hAnsi="Calibri" w:eastAsia="Calibri"/>
+                <w:b w:val="0"/>
+                <w:i w:val="0"/>
+                <w:color w:val="2C2C2C"/>
+                <w:sz w:val="20"/>
+              </w:rPr>
+              <w:t>The sitting already exists</w:t>
+            </w:r>
+          </w:p>
+        </w:tc>
+        <w:tc>
+          <w:tcPr>
+            <w:tcW w:type="dxa" w:w="2550"/>
+            <w:shd w:fill="F4F1EA" w:val="clear"/>
+          </w:tcPr>
+          <w:p>
+            <w:r/>
+            <w:r>
+              <w:rPr>
+                <w:rFonts w:ascii="Calibri" w:hAnsi="Calibri" w:eastAsia="Calibri"/>
+                <w:b w:val="0"/>
+                <w:i w:val="0"/>
+                <w:color w:val="2C2C2C"/>
+                <w:sz w:val="20"/>
+              </w:rPr>
+              <w:t>Belonging</w:t>
+            </w:r>
+          </w:p>
+        </w:tc>
+        <w:tc>
+          <w:tcPr>
+            <w:tcW w:type="dxa" w:w="2550"/>
+            <w:shd w:fill="F4F1EA" w:val="clear"/>
+          </w:tcPr>
+          <w:p>
+            <w:r/>
+            <w:r>
+              <w:rPr>
+                <w:rFonts w:ascii="Calibri" w:hAnsi="Calibri" w:eastAsia="Calibri"/>
+                <w:b w:val="0"/>
+                <w:i w:val="0"/>
+                <w:color w:val="2C2C2C"/>
+                <w:sz w:val="20"/>
+              </w:rPr>
+              <w:t>ChatGPT would hand them another list.</w:t>
+            </w:r>
+          </w:p>
+        </w:tc>
+      </w:tr>
+      <w:tr>
+        <w:tc>
+          <w:tcPr>
+            <w:tcW w:type="dxa" w:w="2550"/>
+          </w:tcPr>
+          <w:p>
+            <w:r/>
+            <w:r>
+              <w:rPr>
+                <w:rFonts w:ascii="Calibri" w:hAnsi="Calibri" w:eastAsia="Calibri"/>
+                <w:b w:val="0"/>
+                <w:i w:val="0"/>
+                <w:color w:val="2C2C2C"/>
+                <w:sz w:val="20"/>
+              </w:rPr>
+              <w:t>7</w:t>
+            </w:r>
+          </w:p>
+        </w:tc>
+        <w:tc>
+          <w:tcPr>
+            <w:tcW w:type="dxa" w:w="2550"/>
+          </w:tcPr>
+          <w:p>
+            <w:r/>
+            <w:r>
+              <w:rPr>
+                <w:rFonts w:ascii="Calibri" w:hAnsi="Calibri" w:eastAsia="Calibri"/>
+                <w:b w:val="0"/>
+                <w:i w:val="0"/>
+                <w:color w:val="2C2C2C"/>
+                <w:sz w:val="20"/>
+              </w:rPr>
+              <w:t>We sell proof, not another list</w:t>
+            </w:r>
+          </w:p>
+        </w:tc>
+        <w:tc>
+          <w:tcPr>
+            <w:tcW w:type="dxa" w:w="2550"/>
+          </w:tcPr>
+          <w:p>
+            <w:r/>
+            <w:r>
+              <w:rPr>
+                <w:rFonts w:ascii="Calibri" w:hAnsi="Calibri" w:eastAsia="Calibri"/>
+                <w:b w:val="0"/>
+                <w:i w:val="0"/>
+                <w:color w:val="2C2C2C"/>
+                <w:sz w:val="20"/>
+              </w:rPr>
+              <w:t>Clarity</w:t>
+            </w:r>
+          </w:p>
+        </w:tc>
+        <w:tc>
+          <w:tcPr>
+            <w:tcW w:type="dxa" w:w="2550"/>
+          </w:tcPr>
+          <w:p>
+            <w:r/>
+            <w:r>
+              <w:rPr>
+                <w:rFonts w:ascii="Calibri" w:hAnsi="Calibri" w:eastAsia="Calibri"/>
+                <w:b w:val="0"/>
+                <w:i w:val="0"/>
+                <w:color w:val="2C2C2C"/>
+                <w:sz w:val="20"/>
+              </w:rPr>
+              <w:t>We do not launch nationally.</w:t>
+            </w:r>
+          </w:p>
+        </w:tc>
+      </w:tr>
+      <w:tr>
+        <w:tc>
+          <w:tcPr>
+            <w:tcW w:type="dxa" w:w="2550"/>
+            <w:shd w:fill="F4F1EA" w:val="clear"/>
+          </w:tcPr>
+          <w:p>
+            <w:r/>
+            <w:r>
+              <w:rPr>
+                <w:rFonts w:ascii="Calibri" w:hAnsi="Calibri" w:eastAsia="Calibri"/>
+                <w:b w:val="0"/>
+                <w:i w:val="0"/>
+                <w:color w:val="2C2C2C"/>
+                <w:sz w:val="20"/>
+              </w:rPr>
+              <w:t>8</w:t>
+            </w:r>
+          </w:p>
+        </w:tc>
+        <w:tc>
+          <w:tcPr>
+            <w:tcW w:type="dxa" w:w="2550"/>
+            <w:shd w:fill="F4F1EA" w:val="clear"/>
+          </w:tcPr>
+          <w:p>
+            <w:r/>
+            <w:r>
+              <w:rPr>
+                <w:rFonts w:ascii="Calibri" w:hAnsi="Calibri" w:eastAsia="Calibri"/>
+                <w:b w:val="0"/>
+                <w:i w:val="0"/>
+                <w:color w:val="2C2C2C"/>
+                <w:sz w:val="20"/>
+              </w:rPr>
+              <w:t>Copy the room</w:t>
+            </w:r>
+          </w:p>
+        </w:tc>
+        <w:tc>
+          <w:tcPr>
+            <w:tcW w:type="dxa" w:w="2550"/>
+            <w:shd w:fill="F4F1EA" w:val="clear"/>
+          </w:tcPr>
+          <w:p>
+            <w:r/>
+            <w:r>
+              <w:rPr>
+                <w:rFonts w:ascii="Calibri" w:hAnsi="Calibri" w:eastAsia="Calibri"/>
+                <w:b w:val="0"/>
+                <w:i w:val="0"/>
+                <w:color w:val="2C2C2C"/>
+                <w:sz w:val="20"/>
+              </w:rPr>
+              <w:t>Inevitable</w:t>
+            </w:r>
+          </w:p>
+        </w:tc>
+        <w:tc>
+          <w:tcPr>
+            <w:tcW w:type="dxa" w:w="2550"/>
+            <w:shd w:fill="F4F1EA" w:val="clear"/>
+          </w:tcPr>
+          <w:p>
+            <w:r/>
+            <w:r>
+              <w:rPr>
+                <w:rFonts w:ascii="Calibri" w:hAnsi="Calibri" w:eastAsia="Calibri"/>
+                <w:b w:val="0"/>
+                <w:i w:val="0"/>
+                <w:color w:val="2C2C2C"/>
+                <w:sz w:val="20"/>
+              </w:rPr>
+              <w:t>We are a challenge team.</w:t>
+            </w:r>
+          </w:p>
+        </w:tc>
+      </w:tr>
+      <w:tr>
+        <w:tc>
+          <w:tcPr>
+            <w:tcW w:type="dxa" w:w="2550"/>
+          </w:tcPr>
+          <w:p>
+            <w:r/>
+            <w:r>
+              <w:rPr>
+                <w:rFonts w:ascii="Calibri" w:hAnsi="Calibri" w:eastAsia="Calibri"/>
+                <w:b w:val="0"/>
+                <w:i w:val="0"/>
+                <w:color w:val="2C2C2C"/>
+                <w:sz w:val="20"/>
+              </w:rPr>
+              <w:t>9</w:t>
+            </w:r>
+          </w:p>
+        </w:tc>
+        <w:tc>
+          <w:tcPr>
+            <w:tcW w:type="dxa" w:w="2550"/>
+          </w:tcPr>
+          <w:p>
+            <w:r/>
+            <w:r>
+              <w:rPr>
+                <w:rFonts w:ascii="Calibri" w:hAnsi="Calibri" w:eastAsia="Calibri"/>
+                <w:b w:val="0"/>
+                <w:i w:val="0"/>
+                <w:color w:val="2C2C2C"/>
+                <w:sz w:val="20"/>
+              </w:rPr>
+              <w:t>Why this group</w:t>
+            </w:r>
+          </w:p>
+        </w:tc>
+        <w:tc>
+          <w:tcPr>
+            <w:tcW w:type="dxa" w:w="2550"/>
+          </w:tcPr>
+          <w:p>
+            <w:r/>
+            <w:r>
+              <w:rPr>
+                <w:rFonts w:ascii="Calibri" w:hAnsi="Calibri" w:eastAsia="Calibri"/>
+                <w:b w:val="0"/>
+                <w:i w:val="0"/>
+                <w:color w:val="2C2C2C"/>
+                <w:sz w:val="20"/>
+              </w:rPr>
+              <w:t>Human</w:t>
+            </w:r>
+          </w:p>
+        </w:tc>
+        <w:tc>
+          <w:tcPr>
+            <w:tcW w:type="dxa" w:w="2550"/>
+          </w:tcPr>
+          <w:p>
+            <w:r/>
+            <w:r>
+              <w:rPr>
+                <w:rFonts w:ascii="Calibri" w:hAnsi="Calibri" w:eastAsia="Calibri"/>
+                <w:b w:val="0"/>
+                <w:i w:val="0"/>
+                <w:color w:val="2C2C2C"/>
+                <w:sz w:val="20"/>
+              </w:rPr>
+              <w:t>Galway. Then one sitting.</w:t>
+            </w:r>
+          </w:p>
+        </w:tc>
+      </w:tr>
+      <w:tr>
+        <w:tc>
+          <w:tcPr>
+            <w:tcW w:type="dxa" w:w="2550"/>
+            <w:shd w:fill="F4F1EA" w:val="clear"/>
+          </w:tcPr>
+          <w:p>
+            <w:r/>
+            <w:r>
+              <w:rPr>
+                <w:rFonts w:ascii="Calibri" w:hAnsi="Calibri" w:eastAsia="Calibri"/>
+                <w:b w:val="0"/>
+                <w:i w:val="0"/>
+                <w:color w:val="2C2C2C"/>
+                <w:sz w:val="20"/>
+              </w:rPr>
+              <w:t>10</w:t>
+            </w:r>
+          </w:p>
+        </w:tc>
+        <w:tc>
+          <w:tcPr>
+            <w:tcW w:type="dxa" w:w="2550"/>
+            <w:shd w:fill="F4F1EA" w:val="clear"/>
+          </w:tcPr>
+          <w:p>
+            <w:r/>
+            <w:r>
+              <w:rPr>
+                <w:rFonts w:ascii="Calibri" w:hAnsi="Calibri" w:eastAsia="Calibri"/>
+                <w:b w:val="0"/>
+                <w:i w:val="0"/>
+                <w:color w:val="2C2C2C"/>
+                <w:sz w:val="20"/>
+              </w:rPr>
+              <w:t>Galway, then one sitting</w:t>
+            </w:r>
+          </w:p>
+        </w:tc>
+        <w:tc>
+          <w:tcPr>
+            <w:tcW w:type="dxa" w:w="2550"/>
+            <w:shd w:fill="F4F1EA" w:val="clear"/>
+          </w:tcPr>
+          <w:p>
+            <w:r/>
+            <w:r>
+              <w:rPr>
+                <w:rFonts w:ascii="Calibri" w:hAnsi="Calibri" w:eastAsia="Calibri"/>
+                <w:b w:val="0"/>
+                <w:i w:val="0"/>
+                <w:color w:val="2C2C2C"/>
+                <w:sz w:val="20"/>
+              </w:rPr>
+              <w:t>The ask</w:t>
+            </w:r>
+          </w:p>
+        </w:tc>
+        <w:tc>
+          <w:tcPr>
+            <w:tcW w:type="dxa" w:w="2550"/>
+            <w:shd w:fill="F4F1EA" w:val="clear"/>
+          </w:tcPr>
+          <w:p>
+            <w:r/>
+            <w:r>
+              <w:rPr>
+                <w:rFonts w:ascii="Calibri" w:hAnsi="Calibri" w:eastAsia="Calibri"/>
+                <w:b w:val="0"/>
+                <w:i w:val="0"/>
+                <w:color w:val="2C2C2C"/>
+                <w:sz w:val="20"/>
+              </w:rPr>
+              <w:t>Stop. Let the slide hold.</w:t>
             </w:r>
           </w:p>
         </w:tc>
@@ -558,7 +1655,7 @@
           <w:color w:val="2C2C2C"/>
           <w:sz w:val="22"/>
         </w:rPr>
-        <w:t>Talk less → show the 1-minute film (keep the whole thing) → click the live product so they see it is real → close and ask → 3 minutes of questions.</w:t>
+        <w:t>Talk less → show the silent film (keep the whole thing, about 52 seconds) → click so they see it is real → close and ask → 3 minutes of questions.</w:t>
       </w:r>
     </w:p>
     <w:p>
@@ -573,7 +1670,7 @@
           <w:color w:val="2C2C2C"/>
           <w:sz w:val="22"/>
         </w:rPr>
-        <w:t>The film may retell the four screens. That is intended. The live click is not a second tour. It is: this is live → confirm → they leave holding the board → flip who is in the interview.</w:t>
+        <w:t>The film may retell the four screens. That is intended. The live click is not a second tour. It is: this is on the laptop → confirm the evidence → name the gap → they leave interview-ready (the board) → flip who is in the interview.</w:t>
       </w:r>
     </w:p>
     <w:tbl>
@@ -649,7 +1746,7 @@
                 <w:color w:val="2C2C2C"/>
                 <w:sz w:val="21"/>
               </w:rPr>
-              <w:t>“The model drafts. A person confirms. They leave with a board.”</w:t>
+              <w:t>“They confirm the evidence. We name the gap. They leave interview-ready.”</w:t>
             </w:r>
           </w:p>
           <w:p>
@@ -667,6 +1764,21 @@
               <w:t>Do not talk through the four screens. The film does that. Local file on the laptop — not YouTube.</w:t>
             </w:r>
           </w:p>
+          <w:p>
+            <w:pPr>
+              <w:spacing w:after="60" w:before="0"/>
+            </w:pPr>
+            <w:r>
+              <w:rPr>
+                <w:rFonts w:ascii="Calibri" w:hAnsi="Calibri" w:eastAsia="Calibri"/>
+                <w:b w:val="0"/>
+                <w:i w:val="0"/>
+                <w:color w:val="2C2C2C"/>
+                <w:sz w:val="21"/>
+              </w:rPr>
+              <w:t>Shipped file: skillsatlas-process-v2.mp4 (about 52 seconds). Copy it next to the slides the night before.</w:t>
+            </w:r>
+          </w:p>
         </w:tc>
       </w:tr>
     </w:tbl>
@@ -714,7 +1826,7 @@
           <w:color w:val="2C2C2C"/>
           <w:sz w:val="22"/>
         </w:rPr>
-        <w:t>SkillsAtlas is that next sitting: they confirm what they actually did, we ask two or three sharp questions, we show two jobs they can reach, and they walk out holding a board — stories and likely interview questions they can carry. We propose. They choose. We do not rank people.</w:t>
+        <w:t>SkillsAtlas is that next sitting: they confirm the evidence, we name the gap, we show two jobs they can reach, and they walk out interview-ready — holding a board. We propose. They choose. We do not rank people.</w:t>
       </w:r>
     </w:p>
     <w:p>
@@ -825,7 +1937,7 @@
                 <w:color w:val="2C2C2C"/>
                 <w:sz w:val="20"/>
               </w:rPr>
-              <w:t>Camunda, BPMN</w:t>
+              <w:t>Camunda, BPMN, agentic, orchestration</w:t>
             </w:r>
           </w:p>
         </w:tc>
@@ -843,7 +1955,7 @@
                 <w:color w:val="2C2C2C"/>
                 <w:sz w:val="20"/>
               </w:rPr>
-              <w:t>The agentic orchestration process — the map in the film of who does what (the model drafts, a person confirms). Not the product name.</w:t>
+              <w:t>The map of the sitting — who does what. The model drafts. A person confirms. Not a product name.</w:t>
             </w:r>
           </w:p>
         </w:tc>
@@ -961,7 +2073,7 @@
                 <w:color w:val="2C2C2C"/>
                 <w:sz w:val="20"/>
               </w:rPr>
-              <w:t>The sitting / the board / two jobs they can reach</w:t>
+              <w:t>The sitting / evidence / a named gap / interview-ready (the board)</w:t>
             </w:r>
           </w:p>
         </w:tc>
@@ -1082,6 +2194,46 @@
           </w:p>
         </w:tc>
       </w:tr>
+      <w:tr>
+        <w:tc>
+          <w:tcPr>
+            <w:tcW w:type="dxa" w:w="5100"/>
+            <w:shd w:fill="F4F1EA" w:val="clear"/>
+          </w:tcPr>
+          <w:p>
+            <w:r/>
+            <w:r>
+              <w:rPr>
+                <w:rFonts w:ascii="Calibri" w:hAnsi="Calibri" w:eastAsia="Calibri"/>
+                <w:b w:val="0"/>
+                <w:i w:val="0"/>
+                <w:color w:val="2C2C2C"/>
+                <w:sz w:val="20"/>
+              </w:rPr>
+              <w:t>Turas Nua / Martina as “our customer”</w:t>
+            </w:r>
+          </w:p>
+        </w:tc>
+        <w:tc>
+          <w:tcPr>
+            <w:tcW w:type="dxa" w:w="5100"/>
+            <w:shd w:fill="F4F1EA" w:val="clear"/>
+          </w:tcPr>
+          <w:p>
+            <w:r/>
+            <w:r>
+              <w:rPr>
+                <w:rFonts w:ascii="Calibri" w:hAnsi="Calibri" w:eastAsia="Calibri"/>
+                <w:b w:val="0"/>
+                <w:i w:val="0"/>
+                <w:color w:val="2C2C2C"/>
+                <w:sz w:val="20"/>
+              </w:rPr>
+              <w:t>We sat with an adviser. Not a signed office.</w:t>
+            </w:r>
+          </w:p>
+        </w:tc>
+      </w:tr>
     </w:tbl>
     <w:p>
       <w:pPr>
@@ -1100,7 +2252,7 @@
           <w:color w:val="5A5A5A"/>
           <w:sz w:val="20"/>
         </w:rPr>
-        <w:t>Do not put on any slide: file names, web-address codes, tool names, a second process lecture.</w:t>
+        <w:t>Do not put on any slide: file names, web-address codes, tool names, a second process lecture, a provider logo as if they buy from us.</w:t>
       </w:r>
     </w:p>
     <w:p>
@@ -1208,7 +2360,7 @@
           <w:color w:val="2C2C2C"/>
           <w:sz w:val="22"/>
         </w:rPr>
-        <w:t>After the film: do not retell all four screens. Land on the board and who is in the interview.</w:t>
+        <w:t>After the film: do not retell all four screens. Point at the named gap, then the board, then who is in the interview.</w:t>
       </w:r>
     </w:p>
     <w:p>
@@ -1343,7 +2495,7 @@
                 <w:color w:val="2C2C2C"/>
                 <w:sz w:val="20"/>
               </w:rPr>
-              <w:t>Hook + problem. Short.</w:t>
+              <w:t>Hook + problem. The aha. Short.</w:t>
             </w:r>
           </w:p>
         </w:tc>
@@ -1458,7 +2610,7 @@
                 <w:color w:val="2C2C2C"/>
                 <w:sz w:val="20"/>
               </w:rPr>
-              <w:t>Whole film, ~1:00. Four screens + the agentic orchestration process. Silent. Let it play.</w:t>
+              <w:t>Whole film, ~52s. Four screens + the map of the sitting. Silent. Let it play.</w:t>
             </w:r>
           </w:p>
         </w:tc>
@@ -1774,7 +2926,7 @@
                 <w:color w:val="F5EBCE"/>
                 <w:sz w:val="22"/>
               </w:rPr>
-              <w:t>They decide in seconds whether this is another careers chatbot.</w:t>
+              <w:t>They already got a list. We hand them proof.</w:t>
             </w:r>
           </w:p>
         </w:tc>
@@ -1784,6 +2936,21 @@
       <w:pPr>
         <w:spacing w:after="160"/>
       </w:pPr>
+    </w:p>
+    <w:p>
+      <w:pPr>
+        <w:spacing w:after="120" w:before="0" w:line="240" w:lineRule="auto"/>
+      </w:pPr>
+      <w:r>
+        <w:rPr>
+          <w:rFonts w:ascii="Calibri" w:hAnsi="Calibri" w:eastAsia="Calibri"/>
+          <w:b w:val="0"/>
+          <w:i/>
+          <w:color w:val="5A5A5A"/>
+          <w:sz w:val="20"/>
+        </w:rPr>
+        <w:t>Picture: One line, huge, on cream. No photos. No logos. SkillsAtlas in the corner.</w:t>
+      </w:r>
     </w:p>
     <w:p>
       <w:pPr>
@@ -1845,7 +3012,7 @@
           <w:color w:val="2C2C2C"/>
           <w:sz w:val="22"/>
         </w:rPr>
-        <w:t>Same CV. Confirmed. Two jobs they can reach. They leave with the board.</w:t>
+        <w:t>Same CV. Evidence. A named gap. They leave interview-ready — the board.</w:t>
       </w:r>
     </w:p>
     <w:p>
@@ -1903,10 +3070,25 @@
           <w:rFonts w:ascii="Calibri" w:hAnsi="Calibri" w:eastAsia="Calibri"/>
           <w:b w:val="0"/>
           <w:i/>
+          <w:color w:val="C4563A"/>
+          <w:sz w:val="20"/>
+        </w:rPr>
+        <w:t>Bridge: That list is not a plan.</w:t>
+      </w:r>
+    </w:p>
+    <w:p>
+      <w:pPr>
+        <w:spacing w:after="160" w:before="0" w:line="240" w:lineRule="auto"/>
+      </w:pPr>
+      <w:r>
+        <w:rPr>
+          <w:rFonts w:ascii="Calibri" w:hAnsi="Calibri" w:eastAsia="Calibri"/>
+          <w:b w:val="0"/>
+          <w:i/>
           <w:color w:val="5A5A5A"/>
           <w:sz w:val="20"/>
         </w:rPr>
-        <w:t>Not on this slide: team names, tech stack, the word “platform”, logos.</w:t>
+        <w:t>Not on this slide: team names, tech stack, the word “platform”, logos, the Enniscorthy office.</w:t>
       </w:r>
     </w:p>
     <w:tbl>
@@ -1951,7 +3133,7 @@
                 <w:color w:val="F5EBCE"/>
                 <w:sz w:val="22"/>
               </w:rPr>
-              <w:t>Assessed, handed a list, left alone for about three weeks.</w:t>
+              <w:t>Ireland assesses people, then leaves them alone.</w:t>
             </w:r>
           </w:p>
         </w:tc>
@@ -1961,6 +3143,21 @@
       <w:pPr>
         <w:spacing w:after="160"/>
       </w:pPr>
+    </w:p>
+    <w:p>
+      <w:pPr>
+        <w:spacing w:after="120" w:before="0" w:line="240" w:lineRule="auto"/>
+      </w:pPr>
+      <w:r>
+        <w:rPr>
+          <w:rFonts w:ascii="Calibri" w:hAnsi="Calibri" w:eastAsia="Calibri"/>
+          <w:b w:val="0"/>
+          <w:i/>
+          <w:color w:val="5A5A5A"/>
+          <w:sz w:val="20"/>
+        </w:rPr>
+        <w:t>Picture: Three beats in a row — Assessed → list → silent weeks. One number under it, large. Source in tiny type.</w:t>
+      </w:r>
     </w:p>
     <w:p>
       <w:pPr>
@@ -2068,7 +3265,22 @@
           <w:color w:val="2C2C2C"/>
           <w:sz w:val="22"/>
         </w:rPr>
-        <w:t>Ireland already does the first half of this job. Someone is assessed. They get a list. Next sitting is about three weeks. In that gap the plan lives only in their head. About 700 contractor roles gone this quarter. We are not replacing that meeting. We take the same CV.</w:t>
+        <w:t>Ireland already does the first half of this job. Someone is assessed. They get a list. Next sitting is about three weeks. In that gap the plan lives only in their head. This quarter, about 700 contractor roles gone — close to home. We are not replacing that meeting. We take the same CV. The adviser cannot choose the next job for them. So they must leave interview-ready — holding something that is theirs.</w:t>
+      </w:r>
+    </w:p>
+    <w:p>
+      <w:pPr>
+        <w:spacing w:after="160" w:before="0" w:line="240" w:lineRule="auto"/>
+      </w:pPr>
+      <w:r>
+        <w:rPr>
+          <w:rFonts w:ascii="Calibri" w:hAnsi="Calibri" w:eastAsia="Calibri"/>
+          <w:b w:val="0"/>
+          <w:i/>
+          <w:color w:val="C4563A"/>
+          <w:sz w:val="20"/>
+        </w:rPr>
+        <w:t>Bridge: Here is that sitting. Four words.</w:t>
       </w:r>
     </w:p>
     <w:tbl>
@@ -2114,7 +3326,7 @@
                 <w:color w:val="2C2C2C"/>
                 <w:sz w:val="21"/>
               </w:rPr>
-              <w:t>Keep ~700 (this quarter, close to home) or switch to Live Register August 2026, 182,517 (CSO, 4 Sep 2026) if you want national scale.</w:t>
+              <w:t>Proposed: keep ~700 on this slide (this quarter, a person you can picture).</w:t>
             </w:r>
           </w:p>
           <w:p>
@@ -2129,7 +3341,7 @@
                 <w:color w:val="2C2C2C"/>
                 <w:sz w:val="21"/>
               </w:rPr>
-              <w:t>Both numbers are sourced. Putting both on the slide fights for attention. Comment which one.</w:t>
+              <w:t>National scale lives on Slide 6 as the tiny Live Register line (182,517). Do not put both numbers here.</w:t>
             </w:r>
           </w:p>
         </w:tc>
@@ -2152,7 +3364,7 @@
           <w:color w:val="5A5A5A"/>
           <w:sz w:val="20"/>
         </w:rPr>
-        <w:t>Not on this slide: five statistics, JobPath money, 2,400 SKUs, blaming workers, the CSO as a customer, a file name as the source.</w:t>
+        <w:t>Not on this slide: five statistics, JobPath money, 2,400 SKUs, blaming workers, the CSO as a customer, a file name as the source, 30% / 850,000.</w:t>
       </w:r>
     </w:p>
     <w:tbl>
@@ -2197,7 +3409,7 @@
                 <w:color w:val="F5EBCE"/>
                 <w:sz w:val="22"/>
               </w:rPr>
-              <w:t>Title card. Four words. Do not lecture.</w:t>
+              <w:t>Confirm. Question. Two jobs. The board.</w:t>
             </w:r>
           </w:p>
         </w:tc>
@@ -2207,6 +3419,21 @@
       <w:pPr>
         <w:spacing w:after="160"/>
       </w:pPr>
+    </w:p>
+    <w:p>
+      <w:pPr>
+        <w:spacing w:after="120" w:before="0" w:line="240" w:lineRule="auto"/>
+      </w:pPr>
+      <w:r>
+        <w:rPr>
+          <w:rFonts w:ascii="Calibri" w:hAnsi="Calibri" w:eastAsia="Calibri"/>
+          <w:b w:val="0"/>
+          <w:i/>
+          <w:color w:val="5A5A5A"/>
+          <w:sz w:val="20"/>
+        </w:rPr>
+        <w:t>Picture: Four words only, large, one line. Tiny constraint under them. No icons lecture.</w:t>
+      </w:r>
     </w:p>
     <w:p>
       <w:pPr>
@@ -2252,7 +3479,7 @@
           <w:color w:val="2C2C2C"/>
           <w:sz w:val="22"/>
         </w:rPr>
-        <w:t>We propose. They choose. We do not rank people.</w:t>
+        <w:t>Evidence. A named gap. Interview-ready. They choose.</w:t>
       </w:r>
     </w:p>
     <w:p>
@@ -2282,7 +3509,7 @@
           <w:color w:val="2C2C2C"/>
           <w:sz w:val="22"/>
         </w:rPr>
-        <w:t>You are about to see that sitting. First the process. Then live.</w:t>
+        <w:t>You are about to see that sitting. Evidence. A named gap. Interview-ready. First on film. Then on the laptop.</w:t>
       </w:r>
     </w:p>
     <w:p>
@@ -2298,6 +3525,21 @@
           <w:sz w:val="22"/>
         </w:rPr>
         <w:t>Do not read four bullet explanations. The film does that.</w:t>
+      </w:r>
+    </w:p>
+    <w:p>
+      <w:pPr>
+        <w:spacing w:after="160" w:before="0" w:line="240" w:lineRule="auto"/>
+      </w:pPr>
+      <w:r>
+        <w:rPr>
+          <w:rFonts w:ascii="Calibri" w:hAnsi="Calibri" w:eastAsia="Calibri"/>
+          <w:b w:val="0"/>
+          <w:i/>
+          <w:color w:val="C4563A"/>
+          <w:sz w:val="20"/>
+        </w:rPr>
+        <w:t>Bridge: One sentence. Then quiet.</w:t>
       </w:r>
     </w:p>
     <w:p>
@@ -2342,7 +3584,7 @@
                 <w:color w:val="FFFFFF"/>
                 <w:sz w:val="28"/>
               </w:rPr>
-              <w:t>SLIDE 4  ·  THE FILM (~1:00)</w:t>
+              <w:t>SLIDE 4  ·  THE FILM (~52S)</w:t>
             </w:r>
           </w:p>
           <w:p>
@@ -2357,7 +3599,7 @@
                 <w:color w:val="F5EBCE"/>
                 <w:sz w:val="22"/>
               </w:rPr>
-              <w:t>Keep the whole film. Four screens and the agentic orchestration process.</w:t>
+              <w:t>Watch the sitting. Do not lecture it.</w:t>
             </w:r>
           </w:p>
         </w:tc>
@@ -2367,6 +3609,21 @@
       <w:pPr>
         <w:spacing w:after="160"/>
       </w:pPr>
+    </w:p>
+    <w:p>
+      <w:pPr>
+        <w:spacing w:after="120" w:before="0" w:line="240" w:lineRule="auto"/>
+      </w:pPr>
+      <w:r>
+        <w:rPr>
+          <w:rFonts w:ascii="Calibri" w:hAnsi="Calibri" w:eastAsia="Calibri"/>
+          <w:b w:val="0"/>
+          <w:i/>
+          <w:color w:val="5A5A5A"/>
+          <w:sz w:val="20"/>
+        </w:rPr>
+        <w:t>Picture: Almost full-bleed video. No other bullets. The film is the slide.</w:t>
+      </w:r>
     </w:p>
     <w:p>
       <w:pPr>
@@ -2380,7 +3637,7 @@
           <w:color w:val="2C2C2C"/>
           <w:sz w:val="22"/>
         </w:rPr>
-        <w:t>Keep the whole film. Four screens and the agentic orchestration process (the map of the sitting: the model drafts, a person confirms). Do not trim to 25 seconds. Do not name the drawing tool.</w:t>
+        <w:t>Keep the whole film. Four screens and the map of the sitting (who does what: the model drafts, a person confirms). Do not trim. Do not name the drawing tool. Shipped file: skillsatlas-process-v2.mp4 (about 52 seconds, silent).</w:t>
       </w:r>
     </w:p>
     <w:p>
@@ -2427,7 +3684,7 @@
           <w:color w:val="2C2C2C"/>
           <w:sz w:val="22"/>
         </w:rPr>
-        <w:t>Tiny caption: The sitting — process and four screens.</w:t>
+        <w:t>Tiny caption: The sitting — who does what, and the four screens.</w:t>
       </w:r>
     </w:p>
     <w:p>
@@ -2473,7 +3730,7 @@
           <w:color w:val="2C2C2C"/>
           <w:sz w:val="22"/>
         </w:rPr>
-        <w:t>One sentence at the start only: “The model drafts. A person confirms. They leave with a board.” Then shut up until it ends. Do not talk over the four screens. Do not add music.</w:t>
+        <w:t>One sentence at the start only: “They confirm the evidence. We name the gap. They leave interview-ready.” Then shut up until it ends. Do not talk over the four screens. Do not add music.</w:t>
       </w:r>
     </w:p>
     <w:p>
@@ -2503,7 +3760,7 @@
           <w:color w:val="2C2C2C"/>
           <w:sz w:val="22"/>
         </w:rPr>
-        <w:t>Same sitting. Live. Look at the browser.</w:t>
+        <w:t>Same sitting. On the laptop. Look at the browser.</w:t>
       </w:r>
     </w:p>
     <w:p>
@@ -2518,7 +3775,7 @@
           <w:color w:val="5A5A5A"/>
           <w:sz w:val="20"/>
         </w:rPr>
-        <w:t>Not on this slide: Camunda, LangGraph, fine-tune, model names, a second process lecture.</w:t>
+        <w:t>Not on this slide: Camunda, BPMN, agentic, LangGraph, fine-tune, model names, a second process lecture.</w:t>
       </w:r>
     </w:p>
     <w:tbl>
@@ -2549,7 +3806,7 @@
                 <w:color w:val="C4563A"/>
                 <w:sz w:val="20"/>
               </w:rPr>
-              <w:t>NOT SEALED — film file</w:t>
+              <w:t>NOT SEALED — film on the laptop</w:t>
             </w:r>
           </w:p>
           <w:p>
@@ -2564,7 +3821,7 @@
                 <w:color w:val="2C2C2C"/>
                 <w:sz w:val="21"/>
               </w:rPr>
-              <w:t>Filename of the video next to the slides, copied onto the presentation laptop the night before.</w:t>
+              <w:t>File is known. Still must be copied onto the presentation laptop the night before.</w:t>
             </w:r>
           </w:p>
           <w:p>
@@ -2632,7 +3889,7 @@
                 <w:color w:val="F5EBCE"/>
                 <w:sz w:val="22"/>
               </w:rPr>
-              <w:t>Proof it is real. Not a second tour of the four screens.</w:t>
+              <w:t>They leave holding the board. You can click it.</w:t>
             </w:r>
           </w:p>
         </w:tc>
@@ -2642,6 +3899,21 @@
       <w:pPr>
         <w:spacing w:after="160"/>
       </w:pPr>
+    </w:p>
+    <w:p>
+      <w:pPr>
+        <w:spacing w:after="120" w:before="0" w:line="240" w:lineRule="auto"/>
+      </w:pPr>
+      <w:r>
+        <w:rPr>
+          <w:rFonts w:ascii="Calibri" w:hAnsi="Calibri" w:eastAsia="Calibri"/>
+          <w:b w:val="0"/>
+          <w:i/>
+          <w:color w:val="5A5A5A"/>
+          <w:sz w:val="20"/>
+        </w:rPr>
+        <w:t>Picture: Dark slide. One line. The browser is the visual. Point at the board, then at the interview flip.</w:t>
+      </w:r>
     </w:p>
     <w:p>
       <w:pPr>
@@ -2671,7 +3943,7 @@
           <w:color w:val="2C2C2C"/>
           <w:sz w:val="22"/>
         </w:rPr>
-        <w:t>Dark. One line: The sitting — live.</w:t>
+        <w:t>Dark. One line: The sitting — on the laptop.</w:t>
       </w:r>
     </w:p>
     <w:p>
@@ -2687,7 +3959,7 @@
           <w:color w:val="2C2C2C"/>
           <w:sz w:val="22"/>
         </w:rPr>
-        <w:t>Optional tiny: the live web address</w:t>
+        <w:t>Optional tiny: the web address</w:t>
       </w:r>
     </w:p>
     <w:tbl>
@@ -2733,7 +4005,7 @@
                 <w:color w:val="2C2C2C"/>
                 <w:sz w:val="21"/>
               </w:rPr>
-              <w:t>Today the public link is still the mock: skillsatlas.vercel.app.</w:t>
+              <w:t>Today the public link is the walkthrough: skillsatlas.vercel.app.</w:t>
             </w:r>
           </w:p>
           <w:p>
@@ -2748,7 +4020,7 @@
                 <w:color w:val="2C2C2C"/>
                 <w:sz w:val="21"/>
               </w:rPr>
-              <w:t>Confirm the address that will actually be printed. Do not put a fake “live” URL on the slide.</w:t>
+              <w:t>Confirm the address that will actually be printed. Do not put a fake “live AI app” URL on the slide if that is still the mock.</w:t>
             </w:r>
           </w:p>
         </w:tc>
@@ -2870,7 +4142,7 @@
           <w:color w:val="2C2C2C"/>
           <w:sz w:val="22"/>
         </w:rPr>
-        <w:t>Same four screens you just saw. This one is live. Nothing is used until they say it is true. Skip is free. Watch this weak line: “managed stock.” … Now it is a number, a tool, a date. That is evidence. That is not a keyword. Two jobs. They pick. We do not rank them. This is what they walk out holding. Say who is in the room — a screen is not a hiring-manager panel. Same evidence, different questions. Every line traces to a confirmed claim.</w:t>
+        <w:t>Same sitting you just saw. You can click it. Nothing is used until they say it is true. Skip is free. Watch this weak line: “managed stock.” … Now it is a number, a tool, a date. That is evidence. That is not a keyword. Two jobs. What already transfers. This is the named gap — one real course. They pick. We do not rank them. This is interview-ready. This is the board. Say who is in the room — a screen is not a hiring-manager panel. Same evidence, different questions. Every line traces to a confirmed claim.</w:t>
       </w:r>
     </w:p>
     <w:p>
@@ -2885,7 +4157,22 @@
           <w:color w:val="2C2C2C"/>
           <w:sz w:val="22"/>
         </w:rPr>
-        <w:t>If the film already showed the first screen, skip it in the app. Land on the board and flip who is in the interview. That is the beat the film cannot do live.</w:t>
+        <w:t>If the film already showed the first screen, skip it in the app. Do not skip the two jobs. Point at the named gap, then land on the board and flip who is in the interview. That is the beat the film cannot do live.</w:t>
+      </w:r>
+    </w:p>
+    <w:p>
+      <w:pPr>
+        <w:spacing w:after="160" w:before="0" w:line="240" w:lineRule="auto"/>
+      </w:pPr>
+      <w:r>
+        <w:rPr>
+          <w:rFonts w:ascii="Calibri" w:hAnsi="Calibri" w:eastAsia="Calibri"/>
+          <w:b w:val="0"/>
+          <w:i/>
+          <w:color w:val="C4563A"/>
+          <w:sz w:val="20"/>
+        </w:rPr>
+        <w:t>Bridge: That person never pays.</w:t>
       </w:r>
     </w:p>
     <w:p>
@@ -2999,7 +4286,7 @@
                 <w:color w:val="F5EBCE"/>
                 <w:sz w:val="22"/>
               </w:rPr>
-              <w:t>The person is the user. The small office is the buyer.</w:t>
+              <w:t>The sitting already exists. We wrap it.</w:t>
             </w:r>
           </w:p>
         </w:tc>
@@ -3009,6 +4296,21 @@
       <w:pPr>
         <w:spacing w:after="160"/>
       </w:pPr>
+    </w:p>
+    <w:p>
+      <w:pPr>
+        <w:spacing w:after="120" w:before="0" w:line="240" w:lineRule="auto"/>
+      </w:pPr>
+      <w:r>
+        <w:rPr>
+          <w:rFonts w:ascii="Calibri" w:hAnsi="Calibri" w:eastAsia="Calibri"/>
+          <w:b w:val="0"/>
+          <w:i/>
+          <w:color w:val="5A5A5A"/>
+          <w:sz w:val="20"/>
+        </w:rPr>
+        <w:t>Picture: Two columns only — The person | The office. Ireland first, small type. No logo wall. Tiny scale line under the columns — not a TAM chart.</w:t>
+      </w:r>
     </w:p>
     <w:p>
       <w:pPr>
@@ -3070,7 +4372,7 @@
           <w:color w:val="2C2C2C"/>
           <w:sz w:val="22"/>
         </w:rPr>
-        <w:t>The buyer: the small office that already sees them. The person does not pay.</w:t>
+        <w:t>The office: already sees them. The person does not pay.</w:t>
       </w:r>
     </w:p>
     <w:p>
@@ -3102,7 +4404,7 @@
           <w:color w:val="2C2C2C"/>
           <w:sz w:val="22"/>
         </w:rPr>
-        <w:t>Big companies can build this. They have AI teams. We start with offices that still hand out a printout.</w:t>
+        <w:t>Tiny caption: 182,517 already on the Live Register (Aug 2026, CSO). Already counted. Still leave with a list.</w:t>
       </w:r>
     </w:p>
     <w:p>
@@ -3132,7 +4434,22 @@
           <w:color w:val="2C2C2C"/>
           <w:sz w:val="22"/>
         </w:rPr>
-        <w:t>The user is the person. The buyer is the office. Not a download. Not a national tender this year.</w:t>
+        <w:t>The user is the person. The buyer is the office. Not a download. Not a national tender this year. This month we sat with an adviser who already does this job. She cannot choose for them. That is the sitting we wrap. 182,517 already counted. They still leave with a list.</w:t>
+      </w:r>
+    </w:p>
+    <w:p>
+      <w:pPr>
+        <w:spacing w:after="160" w:before="0" w:line="240" w:lineRule="auto"/>
+      </w:pPr>
+      <w:r>
+        <w:rPr>
+          <w:rFonts w:ascii="Calibri" w:hAnsi="Calibri" w:eastAsia="Calibri"/>
+          <w:b w:val="0"/>
+          <w:i/>
+          <w:color w:val="C4563A"/>
+          <w:sz w:val="20"/>
+        </w:rPr>
+        <w:t>Bridge: ChatGPT would hand them another list.</w:t>
       </w:r>
     </w:p>
     <w:p>
@@ -3147,7 +4464,7 @@
           <w:color w:val="5A5A5A"/>
           <w:sz w:val="20"/>
         </w:rPr>
-        <w:t>Not on this slide: named providers as customers, 24 market segments, a huge global market number, a second big labour number.</w:t>
+        <w:t>Not on this slide: named providers as customers, 24 market segments, a TAM or global market number, 30% / 850,000, “big companies can build this” (that line lives on Slide 7). Do not add a new market slide.</w:t>
       </w:r>
     </w:p>
     <w:tbl>
@@ -3178,7 +4495,7 @@
                 <w:color w:val="C4563A"/>
                 <w:sz w:val="20"/>
               </w:rPr>
-              <w:t>NOT SEALED — have we spoken to anyone?</w:t>
+              <w:t>NOT SEALED — how we name the conversation</w:t>
             </w:r>
           </w:p>
           <w:p>
@@ -3193,7 +4510,7 @@
                 <w:color w:val="2C2C2C"/>
                 <w:sz w:val="21"/>
               </w:rPr>
-              <w:t>Mentors said a real conversation is a judging bonus.</w:t>
+              <w:t>Mentors said a real conversation is a judging bonus. We have one (Enniscorthy, 9 Sep).</w:t>
             </w:r>
           </w:p>
           <w:p>
@@ -3208,7 +4525,22 @@
                 <w:color w:val="2C2C2C"/>
                 <w:sz w:val="21"/>
               </w:rPr>
-              <w:t>If the conversation log is empty, say so in questions. Do not put a logo up as if they are a customer.</w:t>
+              <w:t>Spoken: “an adviser.” Not a logo. If the team wants a first name, comment.</w:t>
+            </w:r>
+          </w:p>
+          <w:p>
+            <w:pPr>
+              <w:spacing w:after="60" w:before="0"/>
+            </w:pPr>
+            <w:r>
+              <w:rPr>
+                <w:rFonts w:ascii="Calibri" w:hAnsi="Calibri" w:eastAsia="Calibri"/>
+                <w:b w:val="0"/>
+                <w:i w:val="0"/>
+                <w:color w:val="2C2C2C"/>
+                <w:sz w:val="21"/>
+              </w:rPr>
+              <w:t>If we cannot say it without making them a customer, keep it as “an adviser.”</w:t>
             </w:r>
           </w:p>
         </w:tc>
@@ -3261,7 +4593,7 @@
                 <w:color w:val="F5EBCE"/>
                 <w:sz w:val="22"/>
               </w:rPr>
-              <w:t>We sell the sitting. We will not invent a story.</w:t>
+              <w:t>We sell proof, not another list.</w:t>
             </w:r>
           </w:p>
         </w:tc>
@@ -3271,6 +4603,21 @@
       <w:pPr>
         <w:spacing w:after="160"/>
       </w:pPr>
+    </w:p>
+    <w:p>
+      <w:pPr>
+        <w:spacing w:after="120" w:before="0" w:line="240" w:lineRule="auto"/>
+      </w:pPr>
+      <w:r>
+        <w:rPr>
+          <w:rFonts w:ascii="Calibri" w:hAnsi="Calibri" w:eastAsia="Calibri"/>
+          <w:b w:val="0"/>
+          <w:i/>
+          <w:color w:val="5A5A5A"/>
+          <w:sz w:val="20"/>
+        </w:rPr>
+        <w:t>Picture: Left: a course list / chat window. Right: the board. One line under: the person never pays.</w:t>
+      </w:r>
     </w:p>
     <w:p>
       <w:pPr>
@@ -3348,7 +4695,7 @@
           <w:color w:val="2C2C2C"/>
           <w:sz w:val="22"/>
         </w:rPr>
-        <w:t>Why a bank won’t be our first sale: they can build this. We stay with offices that still run on a printout.</w:t>
+        <w:t>ChatGPT hands you another list. We will not print a story they did not confirm.</w:t>
       </w:r>
     </w:p>
     <w:p>
@@ -3364,7 +4711,7 @@
           <w:color w:val="2C2C2C"/>
           <w:sz w:val="22"/>
         </w:rPr>
-        <w:t>ChatGPT hands you another list. We will not print a story they did not confirm.</w:t>
+        <w:t>Big companies can copy this. We start with offices that still hand out a printout.</w:t>
       </w:r>
     </w:p>
     <w:p>
@@ -3394,7 +4741,22 @@
           <w:color w:val="2C2C2C"/>
           <w:sz w:val="22"/>
         </w:rPr>
-        <w:t>The person never pays here. We are not promising better placement numbers. We are promising they leave with proof.</w:t>
+        <w:t>The person never pays here. We are not promising better placement numbers. We are promising they leave interview-ready. A bank can build this. They have an AI team. We stay with the office that still runs on a printout.</w:t>
+      </w:r>
+    </w:p>
+    <w:p>
+      <w:pPr>
+        <w:spacing w:after="160" w:before="0" w:line="240" w:lineRule="auto"/>
+      </w:pPr>
+      <w:r>
+        <w:rPr>
+          <w:rFonts w:ascii="Calibri" w:hAnsi="Calibri" w:eastAsia="Calibri"/>
+          <w:b w:val="0"/>
+          <w:i/>
+          <w:color w:val="C4563A"/>
+          <w:sz w:val="20"/>
+        </w:rPr>
+        <w:t>Bridge: We do not launch nationally. We copy the room.</w:t>
       </w:r>
     </w:p>
     <w:p>
@@ -3469,7 +4831,7 @@
                 <w:color w:val="F5EBCE"/>
                 <w:sz w:val="22"/>
               </w:rPr>
-              <w:t>Copy the sitting. Each gate has a stop. Not ads.</w:t>
+              <w:t>Land one room. Then copy the room.</w:t>
             </w:r>
           </w:p>
         </w:tc>
@@ -3479,6 +4841,21 @@
       <w:pPr>
         <w:spacing w:after="160"/>
       </w:pPr>
+    </w:p>
+    <w:p>
+      <w:pPr>
+        <w:spacing w:after="120" w:before="0" w:line="240" w:lineRule="auto"/>
+      </w:pPr>
+      <w:r>
+        <w:rPr>
+          <w:rFonts w:ascii="Calibri" w:hAnsi="Calibri" w:eastAsia="Calibri"/>
+          <w:b w:val="0"/>
+          <w:i/>
+          <w:color w:val="5A5A5A"/>
+          <w:sz w:val="20"/>
+        </w:rPr>
+        <w:t>Picture: A path, not a hockey stick. 10 → 20 → 200. Caption: Proposed. These are not users we have.</w:t>
+      </w:r>
     </w:p>
     <w:p>
       <w:pPr>
@@ -3888,6 +5265,21 @@
           <w:rFonts w:ascii="Calibri" w:hAnsi="Calibri" w:eastAsia="Calibri"/>
           <w:b w:val="0"/>
           <w:i/>
+          <w:color w:val="C4563A"/>
+          <w:sz w:val="20"/>
+        </w:rPr>
+        <w:t>Bridge: We are a challenge team. Here is why we can show this.</w:t>
+      </w:r>
+    </w:p>
+    <w:p>
+      <w:pPr>
+        <w:spacing w:after="160" w:before="0" w:line="240" w:lineRule="auto"/>
+      </w:pPr>
+      <w:r>
+        <w:rPr>
+          <w:rFonts w:ascii="Calibri" w:hAnsi="Calibri" w:eastAsia="Calibri"/>
+          <w:b w:val="0"/>
+          <w:i/>
           <w:color w:val="5A5A5A"/>
           <w:sz w:val="20"/>
         </w:rPr>
@@ -3937,7 +5329,7 @@
                 <w:color w:val="2C2C2C"/>
                 <w:sz w:val="21"/>
               </w:rPr>
-              <w:t>Who is the first adviser / office we can actually book?</w:t>
+              <w:t>We have a conversation. We do not have a booked sitting.</w:t>
             </w:r>
           </w:p>
           <w:p>
@@ -3952,7 +5344,7 @@
                 <w:color w:val="2C2C2C"/>
                 <w:sz w:val="21"/>
               </w:rPr>
-              <w:t>If we do not have a name, keep the table as a plan and do not dress it as traction.</w:t>
+              <w:t>Keep the table as a plan. Do not dress 10 as traction.</w:t>
             </w:r>
           </w:p>
         </w:tc>
@@ -4005,7 +5397,7 @@
                 <w:color w:val="F5EBCE"/>
                 <w:sz w:val="22"/>
               </w:rPr>
-              <w:t>Why this group — and what we still lack.</w:t>
+              <w:t>Why this group can show this — and what we still lack.</w:t>
             </w:r>
           </w:p>
         </w:tc>
@@ -4015,6 +5407,21 @@
       <w:pPr>
         <w:spacing w:after="160"/>
       </w:pPr>
+    </w:p>
+    <w:p>
+      <w:pPr>
+        <w:spacing w:after="120" w:before="0" w:line="240" w:lineRule="auto"/>
+      </w:pPr>
+      <w:r>
+        <w:rPr>
+          <w:rFonts w:ascii="Calibri" w:hAnsi="Calibri" w:eastAsia="Calibri"/>
+          <w:b w:val="0"/>
+          <w:i/>
+          <w:color w:val="5A5A5A"/>
+          <w:sz w:val="20"/>
+        </w:rPr>
+        <w:t>Picture: Names and one true line each. Not job titles in a row. A small honest hole: no signed buyer yet.</w:t>
+      </w:r>
     </w:p>
     <w:p>
       <w:pPr>
@@ -4081,6 +5488,22 @@
     </w:p>
     <w:p>
       <w:pPr>
+        <w:pStyle w:val="ListBullet"/>
+        <w:spacing w:after="60" w:before="0"/>
+      </w:pPr>
+      <w:r>
+        <w:rPr>
+          <w:rFonts w:ascii="Calibri" w:hAnsi="Calibri" w:eastAsia="Calibri"/>
+          <w:b w:val="0"/>
+          <w:i w:val="0"/>
+          <w:color w:val="2C2C2C"/>
+          <w:sz w:val="22"/>
+        </w:rPr>
+        <w:t>Working line: one of us sat with an adviser this month. She cannot choose for them.</w:t>
+      </w:r>
+    </w:p>
+    <w:p>
+      <w:pPr>
         <w:spacing w:after="80" w:before="160" w:line="240" w:lineRule="auto"/>
       </w:pPr>
       <w:r>
@@ -4106,7 +5529,7 @@
           <w:color w:val="2C2C2C"/>
           <w:sz w:val="22"/>
         </w:rPr>
-        <w:t>One unfair angle, only if true. Do not invent one.</w:t>
+        <w:t>One of us sat with an adviser this month. She cannot choose for them. That is why they leave holding a board they wrote. One of us is HR, and will not let us invent a story for the interview. We can show this cold. We do not have a signed office. We will not pretend.</w:t>
       </w:r>
     </w:p>
     <w:p>
@@ -4121,7 +5544,7 @@
           <w:color w:val="5A5A5A"/>
           <w:sz w:val="20"/>
         </w:rPr>
-        <w:t>Not on this slide: fake completeness.</w:t>
+        <w:t>Not on this slide: fake completeness, Camunda, a fake unfair angle.</w:t>
       </w:r>
     </w:p>
     <w:tbl>
@@ -4236,7 +5659,7 @@
                 <w:color w:val="2C2C2C"/>
                 <w:sz w:val="21"/>
               </w:rPr>
-              <w:t>Only if it is true (for example: someone in the room who knows Irish activation, or someone who has already sat with workers).</w:t>
+              <w:t>Proposed, only because it is true: the field sitting + HR who will not invent.</w:t>
             </w:r>
           </w:p>
           <w:p>
@@ -4251,7 +5674,7 @@
                 <w:color w:val="2C2C2C"/>
                 <w:sz w:val="21"/>
               </w:rPr>
-              <w:t>If we cannot say it without blushing, cut it.</w:t>
+              <w:t>If we cannot say it without blushing, cut it. Do not add “we already built WhatsApp” unless that switch is on.</w:t>
             </w:r>
           </w:p>
         </w:tc>
@@ -4304,7 +5727,7 @@
                 <w:color w:val="F5EBCE"/>
                 <w:sz w:val="22"/>
               </w:rPr>
-              <w:t>Galway. Then one sitting. This slide stays up in questions.</w:t>
+              <w:t>Send us to Galway. Then one sitting.</w:t>
             </w:r>
           </w:p>
         </w:tc>
@@ -4314,6 +5737,21 @@
       <w:pPr>
         <w:spacing w:after="160"/>
       </w:pPr>
+    </w:p>
+    <w:p>
+      <w:pPr>
+        <w:spacing w:after="120" w:before="0" w:line="240" w:lineRule="auto"/>
+      </w:pPr>
+      <w:r>
+        <w:rPr>
+          <w:rFonts w:ascii="Calibri" w:hAnsi="Calibri" w:eastAsia="Calibri"/>
+          <w:b w:val="0"/>
+          <w:i/>
+          <w:color w:val="5A5A5A"/>
+          <w:sz w:val="20"/>
+        </w:rPr>
+        <w:t>Picture: Two steps only. Galway. Then one adviser. The slide stays up in questions. Contact in the corner when we have it.</w:t>
+      </w:r>
     </w:p>
     <w:p>
       <w:pPr>
@@ -4587,6 +6025,45 @@
                 <w:color w:val="2C2C2C"/>
                 <w:sz w:val="20"/>
               </w:rPr>
+              <w:t>Is this the thing in the application?</w:t>
+            </w:r>
+          </w:p>
+        </w:tc>
+        <w:tc>
+          <w:tcPr>
+            <w:tcW w:type="dxa" w:w="5100"/>
+          </w:tcPr>
+          <w:p>
+            <w:r/>
+            <w:r>
+              <w:rPr>
+                <w:rFonts w:ascii="Calibri" w:hAnsi="Calibri" w:eastAsia="Calibri"/>
+                <w:b w:val="0"/>
+                <w:i w:val="0"/>
+                <w:color w:val="2C2C2C"/>
+                <w:sz w:val="20"/>
+              </w:rPr>
+              <w:t>Yes. Evidence in. Two reachable paths. A named gap with a real course. Interview-ready proof — the board. The sitting is how Ireland already meets the worker. We wrapped that.</w:t>
+            </w:r>
+          </w:p>
+        </w:tc>
+      </w:tr>
+      <w:tr>
+        <w:tc>
+          <w:tcPr>
+            <w:tcW w:type="dxa" w:w="5100"/>
+            <w:shd w:fill="F4F1EA" w:val="clear"/>
+          </w:tcPr>
+          <w:p>
+            <w:r/>
+            <w:r>
+              <w:rPr>
+                <w:rFonts w:ascii="Calibri" w:hAnsi="Calibri" w:eastAsia="Calibri"/>
+                <w:b w:val="0"/>
+                <w:i w:val="0"/>
+                <w:color w:val="2C2C2C"/>
+                <w:sz w:val="20"/>
+              </w:rPr>
               <w:t>Who else?</w:t>
             </w:r>
           </w:p>
@@ -4594,6 +6071,7 @@
         <w:tc>
           <w:tcPr>
             <w:tcW w:type="dxa" w:w="5100"/>
+            <w:shd w:fill="F4F1EA" w:val="clear"/>
           </w:tcPr>
           <w:p>
             <w:r/>
@@ -4614,7 +6092,6 @@
         <w:tc>
           <w:tcPr>
             <w:tcW w:type="dxa" w:w="5100"/>
-            <w:shd w:fill="F4F1EA" w:val="clear"/>
           </w:tcPr>
           <w:p>
             <w:r/>
@@ -4633,7 +6110,6 @@
         <w:tc>
           <w:tcPr>
             <w:tcW w:type="dxa" w:w="5100"/>
-            <w:shd w:fill="F4F1EA" w:val="clear"/>
           </w:tcPr>
           <w:p>
             <w:r/>
@@ -4645,7 +6121,7 @@
                 <w:color w:val="2C2C2C"/>
                 <w:sz w:val="20"/>
               </w:rPr>
-              <w:t>The film is how we designed the sitting — the agentic orchestration process. What you clicked is the product. The drawing tool is not running the live demo this fortnight.</w:t>
+              <w:t>The film is how we designed the sitting — who does what. What you clicked is the product. The drawing tool is not running the laptop this fortnight.</w:t>
             </w:r>
           </w:p>
         </w:tc>
@@ -4654,6 +6130,7 @@
         <w:tc>
           <w:tcPr>
             <w:tcW w:type="dxa" w:w="5100"/>
+            <w:shd w:fill="F4F1EA" w:val="clear"/>
           </w:tcPr>
           <w:p>
             <w:r/>
@@ -4672,6 +6149,7 @@
         <w:tc>
           <w:tcPr>
             <w:tcW w:type="dxa" w:w="5100"/>
+            <w:shd w:fill="F4F1EA" w:val="clear"/>
           </w:tcPr>
           <w:p>
             <w:r/>
@@ -4692,7 +6170,6 @@
         <w:tc>
           <w:tcPr>
             <w:tcW w:type="dxa" w:w="5100"/>
-            <w:shd w:fill="F4F1EA" w:val="clear"/>
           </w:tcPr>
           <w:p>
             <w:r/>
@@ -4711,7 +6188,6 @@
         <w:tc>
           <w:tcPr>
             <w:tcW w:type="dxa" w:w="5100"/>
-            <w:shd w:fill="F4F1EA" w:val="clear"/>
           </w:tcPr>
           <w:p>
             <w:r/>
@@ -4732,6 +6208,7 @@
         <w:tc>
           <w:tcPr>
             <w:tcW w:type="dxa" w:w="5100"/>
+            <w:shd w:fill="F4F1EA" w:val="clear"/>
           </w:tcPr>
           <w:p>
             <w:r/>
@@ -4750,6 +6227,7 @@
         <w:tc>
           <w:tcPr>
             <w:tcW w:type="dxa" w:w="5100"/>
+            <w:shd w:fill="F4F1EA" w:val="clear"/>
           </w:tcPr>
           <w:p>
             <w:r/>
@@ -4761,7 +6239,45 @@
                 <w:color w:val="2C2C2C"/>
                 <w:sz w:val="20"/>
               </w:rPr>
-              <w:t>Only what is in the conversation log. If the log is empty, say so.</w:t>
+              <w:t>Yes. An adviser, this month. They cannot choose for the applicant. We sent a follow-up. It is a conversation, not a contract. We will not put their office on a slide as a customer.</w:t>
+            </w:r>
+          </w:p>
+        </w:tc>
+      </w:tr>
+      <w:tr>
+        <w:tc>
+          <w:tcPr>
+            <w:tcW w:type="dxa" w:w="5100"/>
+          </w:tcPr>
+          <w:p>
+            <w:r/>
+            <w:r>
+              <w:rPr>
+                <w:rFonts w:ascii="Calibri" w:hAnsi="Calibri" w:eastAsia="Calibri"/>
+                <w:b w:val="0"/>
+                <w:i w:val="0"/>
+                <w:color w:val="2C2C2C"/>
+                <w:sz w:val="20"/>
+              </w:rPr>
+              <w:t>How big is the sitting already?</w:t>
+            </w:r>
+          </w:p>
+        </w:tc>
+        <w:tc>
+          <w:tcPr>
+            <w:tcW w:type="dxa" w:w="5100"/>
+          </w:tcPr>
+          <w:p>
+            <w:r/>
+            <w:r>
+              <w:rPr>
+                <w:rFonts w:ascii="Calibri" w:hAnsi="Calibri" w:eastAsia="Calibri"/>
+                <w:b w:val="0"/>
+                <w:i w:val="0"/>
+                <w:color w:val="2C2C2C"/>
+                <w:sz w:val="20"/>
+              </w:rPr>
+              <w:t>Point at Slide 6. 182,517 already counted (CSO, Aug 2026). Not a TAM. They still leave with a list. ~700 on Slide 2 is this quarter, close to home.</w:t>
             </w:r>
           </w:p>
         </w:tc>
@@ -4801,7 +6317,7 @@
                 <w:color w:val="2C2C2C"/>
                 <w:sz w:val="20"/>
               </w:rPr>
-              <w:t>Four screens, the film, the live path. No paying seats. We will not pretend.</w:t>
+              <w:t>Four screens, the film, the path on the laptop, one conversation. No paying seats. We will not pretend.</w:t>
             </w:r>
           </w:p>
         </w:tc>
@@ -4836,7 +6352,7 @@
           <w:color w:val="2C2C2C"/>
           <w:sz w:val="22"/>
         </w:rPr>
-        <w:t>This replaces any older four-minute speech. Do not read both.</w:t>
+        <w:t>This replaces any older four-minute speech. Do not read both. Read it on a clock without the slides once. If it still makes sense, the deck is doing its job.</w:t>
       </w:r>
     </w:p>
     <w:p>
@@ -4866,7 +6382,7 @@
           <w:color w:val="2C2C2C"/>
           <w:sz w:val="22"/>
         </w:rPr>
-        <w:t>Everyone else hands you a list. We hand you proof. Ireland already assesses people. They get a course list. See you in three weeks. In that gap the plan lives only in their head. About 700 contractor roles gone this quarter. We take the same CV. We do not replace the meeting.</w:t>
+        <w:t>Everyone else hands you a list. We hand you proof. Ireland already assesses people. They get a course list. See you in three weeks. In that gap the plan lives only in their head. This quarter, about 700 contractor roles gone — close to home. We do not replace that meeting. We take the same CV. The adviser cannot choose for them. So they walk out interview-ready — holding something that is theirs.</w:t>
       </w:r>
     </w:p>
     <w:p>
@@ -4896,7 +6412,7 @@
           <w:color w:val="2C2C2C"/>
           <w:sz w:val="22"/>
         </w:rPr>
-        <w:t>Confirm. Question. Two jobs. The board. First the process — then live.</w:t>
+        <w:t>Confirm. Question. Two jobs. The board. Evidence. A named gap. Interview-ready. First on film — then on the laptop.</w:t>
       </w:r>
     </w:p>
     <w:p>
@@ -4926,7 +6442,7 @@
           <w:color w:val="2C2C2C"/>
           <w:sz w:val="22"/>
         </w:rPr>
-        <w:t>One sentence: The model drafts. A person confirms. They leave with a board. Then quiet. Do not narrate the four screens.</w:t>
+        <w:t>One sentence: They confirm the evidence. We name the gap. They leave interview-ready. Then quiet. Do not narrate the four screens.</w:t>
       </w:r>
     </w:p>
     <w:p>
@@ -4956,7 +6472,7 @@
           <w:color w:val="2C2C2C"/>
           <w:sz w:val="22"/>
         </w:rPr>
-        <w:t>Same sitting. Live. Nothing used until they say yes. Watch “managed stock.” Two jobs. They pick. This is the board. Flip who is in the room. Same evidence, different questions. Every line traces to a confirmed claim.</w:t>
+        <w:t>Same sitting. You can click it. Nothing used until they say yes. Watch “managed stock.” That is evidence. Two jobs. This is the named gap. They pick. This is interview-ready — the board. Flip who is in the room. Same evidence, different questions. Every line traces to a confirmed claim.</w:t>
       </w:r>
     </w:p>
     <w:p>
@@ -4986,7 +6502,7 @@
           <w:color w:val="2C2C2C"/>
           <w:sz w:val="22"/>
         </w:rPr>
-        <w:t>The person does not pay. The small office is the buyer. We make the weeks between appointments count. Big companies can copy this — we start with a printout. ChatGPT is another list. We will not invent a story. Ten boards in one sitting. Twenty when that office copies. Two hundred when other small offices copy. If the first ten do not come back holding a board, we stop. We are a challenge team. Names — not sealed. Send us to Galway. Then one adviser, one sitting.</w:t>
+        <w:t>That person never pays. The small office already sees them. This month we sat with an adviser who does this job. She cannot choose for them. We wrap that sitting. 182,517 already counted. They still leave with a list. ChatGPT is another list. We will not invent a story. A bank can copy this. We start with a printout. Ten boards in one sitting. Twenty when that office copies. Two hundred when other small offices copy. If the first ten do not come back holding a board, we stop. We are a challenge team. One of us sat in that room. One of us is HR, and will not let us invent a story. Names — not sealed. Send us to Galway. Then one adviser, one sitting.</w:t>
       </w:r>
     </w:p>
     <w:p>
@@ -5112,7 +6628,7 @@
                 <w:color w:val="2C2C2C"/>
                 <w:sz w:val="20"/>
               </w:rPr>
-              <w:t>Not sealed</w:t>
+              <w:t>Sealed</w:t>
             </w:r>
           </w:p>
         </w:tc>
@@ -5130,7 +6646,7 @@
                 <w:color w:val="2C2C2C"/>
                 <w:sz w:val="20"/>
               </w:rPr>
-              <w:t>Slide 2: keep ~700 or switch to 182,517. Not both.</w:t>
+              <w:t>Slide 2: ~700. Slide 6 tiny caption: 182,517. Not both on one slide. Not a new market slide.</w:t>
             </w:r>
           </w:p>
         </w:tc>
@@ -5151,7 +6667,7 @@
                 <w:color w:val="2C2C2C"/>
                 <w:sz w:val="20"/>
               </w:rPr>
-              <w:t>Not sealed</w:t>
+              <w:t>File known</w:t>
             </w:r>
           </w:p>
         </w:tc>
@@ -5170,7 +6686,7 @@
                 <w:color w:val="2C2C2C"/>
                 <w:sz w:val="20"/>
               </w:rPr>
-              <w:t>Film file on the presentation laptop. Whole cut, ~1:00, four screens + agentic orchestration process. Silent. Caption readable.</w:t>
+              <w:t>Film on the presentation laptop: skillsatlas-process-v2.mp4, whole cut, ~52s, silent. Caption readable.</w:t>
             </w:r>
           </w:p>
         </w:tc>
@@ -5208,7 +6724,7 @@
                 <w:color w:val="2C2C2C"/>
                 <w:sz w:val="20"/>
               </w:rPr>
-              <w:t>Presenter says Slides 1–2 on a clock. If it exceeds 50 seconds, cut it.</w:t>
+              <w:t>Presenter says Slides 1–2 on a clock. If it exceeds 50 seconds, cut the last sentence, not the 700.</w:t>
             </w:r>
           </w:p>
         </w:tc>
@@ -5286,7 +6802,85 @@
                 <w:color w:val="2C2C2C"/>
                 <w:sz w:val="20"/>
               </w:rPr>
-              <w:t>Slide 9: names · who talks · who clicks · unfair angle only if true</w:t>
+              <w:t>Slide 9: names · who talks · who clicks</w:t>
+            </w:r>
+          </w:p>
+        </w:tc>
+      </w:tr>
+      <w:tr>
+        <w:tc>
+          <w:tcPr>
+            <w:tcW w:type="dxa" w:w="5100"/>
+            <w:shd w:fill="F4F1EA" w:val="clear"/>
+          </w:tcPr>
+          <w:p>
+            <w:r/>
+            <w:r>
+              <w:rPr>
+                <w:rFonts w:ascii="Calibri" w:hAnsi="Calibri" w:eastAsia="Calibri"/>
+                <w:b w:val="0"/>
+                <w:i w:val="0"/>
+                <w:color w:val="2C2C2C"/>
+                <w:sz w:val="20"/>
+              </w:rPr>
+              <w:t>Proposed</w:t>
+            </w:r>
+          </w:p>
+        </w:tc>
+        <w:tc>
+          <w:tcPr>
+            <w:tcW w:type="dxa" w:w="5100"/>
+            <w:shd w:fill="F4F1EA" w:val="clear"/>
+          </w:tcPr>
+          <w:p>
+            <w:r/>
+            <w:r>
+              <w:rPr>
+                <w:rFonts w:ascii="Calibri" w:hAnsi="Calibri" w:eastAsia="Calibri"/>
+                <w:b w:val="0"/>
+                <w:i w:val="0"/>
+                <w:color w:val="2C2C2C"/>
+                <w:sz w:val="20"/>
+              </w:rPr>
+              <w:t>Unfair angle: field sitting + HR who will not invent. Comment if that is not the line.</w:t>
+            </w:r>
+          </w:p>
+        </w:tc>
+      </w:tr>
+      <w:tr>
+        <w:tc>
+          <w:tcPr>
+            <w:tcW w:type="dxa" w:w="5100"/>
+          </w:tcPr>
+          <w:p>
+            <w:r/>
+            <w:r>
+              <w:rPr>
+                <w:rFonts w:ascii="Calibri" w:hAnsi="Calibri" w:eastAsia="Calibri"/>
+                <w:b w:val="0"/>
+                <w:i w:val="0"/>
+                <w:color w:val="2C2C2C"/>
+                <w:sz w:val="20"/>
+              </w:rPr>
+              <w:t>Not sealed</w:t>
+            </w:r>
+          </w:p>
+        </w:tc>
+        <w:tc>
+          <w:tcPr>
+            <w:tcW w:type="dxa" w:w="5100"/>
+          </w:tcPr>
+          <w:p>
+            <w:r/>
+            <w:r>
+              <w:rPr>
+                <w:rFonts w:ascii="Calibri" w:hAnsi="Calibri" w:eastAsia="Calibri"/>
+                <w:b w:val="0"/>
+                <w:i w:val="0"/>
+                <w:color w:val="2C2C2C"/>
+                <w:sz w:val="20"/>
+              </w:rPr>
+              <w:t>Slide 10: one email + one URL</w:t>
             </w:r>
           </w:p>
         </w:tc>
@@ -5326,7 +6920,7 @@
                 <w:color w:val="2C2C2C"/>
                 <w:sz w:val="20"/>
               </w:rPr>
-              <w:t>Slide 10: one email + one URL</w:t>
+              <w:t>Walkthrough URL that will actually be on the slide</w:t>
             </w:r>
           </w:p>
         </w:tc>
@@ -5346,7 +6940,7 @@
                 <w:color w:val="2C2C2C"/>
                 <w:sz w:val="20"/>
               </w:rPr>
-              <w:t>Not sealed</w:t>
+              <w:t>Proposed</w:t>
             </w:r>
           </w:p>
         </w:tc>
@@ -5364,7 +6958,7 @@
                 <w:color w:val="2C2C2C"/>
                 <w:sz w:val="20"/>
               </w:rPr>
-              <w:t>Live URL that will actually be on the slide</w:t>
+              <w:t>Conversation: say “an adviser this month.” No logo. No booked sitting claimed.</w:t>
             </w:r>
           </w:p>
         </w:tc>
@@ -5385,7 +6979,7 @@
                 <w:color w:val="2C2C2C"/>
                 <w:sz w:val="20"/>
               </w:rPr>
-              <w:t>Not sealed</w:t>
+              <w:t>Rehearsal</w:t>
             </w:r>
           </w:p>
         </w:tc>
@@ -5404,45 +6998,7 @@
                 <w:color w:val="2C2C2C"/>
                 <w:sz w:val="20"/>
               </w:rPr>
-              <w:t>First adviser / conversation — or we stay honest that we have not spoken yet</w:t>
-            </w:r>
-          </w:p>
-        </w:tc>
-      </w:tr>
-      <w:tr>
-        <w:tc>
-          <w:tcPr>
-            <w:tcW w:type="dxa" w:w="5100"/>
-          </w:tcPr>
-          <w:p>
-            <w:r/>
-            <w:r>
-              <w:rPr>
-                <w:rFonts w:ascii="Calibri" w:hAnsi="Calibri" w:eastAsia="Calibri"/>
-                <w:b w:val="0"/>
-                <w:i w:val="0"/>
-                <w:color w:val="2C2C2C"/>
-                <w:sz w:val="20"/>
-              </w:rPr>
-              <w:t>Rehearsal</w:t>
-            </w:r>
-          </w:p>
-        </w:tc>
-        <w:tc>
-          <w:tcPr>
-            <w:tcW w:type="dxa" w:w="5100"/>
-          </w:tcPr>
-          <w:p>
-            <w:r/>
-            <w:r>
-              <w:rPr>
-                <w:rFonts w:ascii="Calibri" w:hAnsi="Calibri" w:eastAsia="Calibri"/>
-                <w:b w:val="0"/>
-                <w:i w:val="0"/>
-                <w:color w:val="2C2C2C"/>
-                <w:sz w:val="20"/>
-              </w:rPr>
-              <w:t>One full run of 7:00 with silent film and live click, both people</w:t>
+              <w:t>One full run of 7:00 with silent film and live click, both people — and once with the projector off.</w:t>
             </w:r>
           </w:p>
         </w:tc>

</xml_diff>